<commit_message>
Updates template to use dynamic placeholders and hyperlinks
Replaces static text and hardcoded values with dynamic placeholders
to improve template flexibility and adaptability for different data sets.
Adds file hyperlinks to relevant fields for easier document navigation.
Updates recipient and signatory details for accuracy and consistency.
</commit_message>
<xml_diff>
--- a/diamond_web/fixtures/default_templates/surat_pkdi_regional_lengkap.docx
+++ b/diamond_web/fixtures/default_templates/surat_pkdi_regional_lengkap.docx
@@ -1,18 +1,18 @@
 
 <file path=word/document.xml><?xml version="1.0" encoding="utf-8"?>
-<w:document xmlns:wpc="http://schemas.microsoft.com/office/word/2010/wordprocessingCanvas" xmlns:cx="http://schemas.microsoft.com/office/drawing/2014/chartex" xmlns:cx1="http://schemas.microsoft.com/office/drawing/2015/9/8/chartex" xmlns:cx2="http://schemas.microsoft.com/office/drawing/2015/10/21/chartex" xmlns:cx3="http://schemas.microsoft.com/office/drawing/2016/5/9/chartex" xmlns:cx4="http://schemas.microsoft.com/office/drawing/2016/5/10/chartex" xmlns:cx5="http://schemas.microsoft.com/office/drawing/2016/5/11/chartex" xmlns:cx6="http://schemas.microsoft.com/office/drawing/2016/5/12/chartex" xmlns:cx7="http://schemas.microsoft.com/office/drawing/2016/5/13/chartex" xmlns:cx8="http://schemas.microsoft.com/office/drawing/2016/5/14/chartex" xmlns:mc="http://schemas.openxmlformats.org/markup-compatibility/2006" xmlns:aink="http://schemas.microsoft.com/office/drawing/2016/ink" xmlns:am3d="http://schemas.microsoft.com/office/drawing/2017/model3d" xmlns:o="urn:schemas-microsoft-com:office:office" xmlns:r="http://schemas.openxmlformats.org/officeDocument/2006/relationships" xmlns:m="http://schemas.openxmlformats.org/officeDocument/2006/math" xmlns:v="urn:schemas-microsoft-com:vml" xmlns:wp14="http://schemas.microsoft.com/office/word/2010/wordprocessingDrawing" xmlns:wp="http://schemas.openxmlformats.org/drawingml/2006/wordprocessingDrawing" xmlns:w10="urn:schemas-microsoft-com:office:word" xmlns:w="http://schemas.openxmlformats.org/wordprocessingml/2006/main" xmlns:w14="http://schemas.microsoft.com/office/word/2010/wordml" xmlns:w15="http://schemas.microsoft.com/office/word/2012/wordml" xmlns:w16cex="http://schemas.microsoft.com/office/word/2018/wordml/cex" xmlns:w16cid="http://schemas.microsoft.com/office/word/2016/wordml/cid" xmlns:w16="http://schemas.microsoft.com/office/word/2018/wordml" xmlns:w16sdtdh="http://schemas.microsoft.com/office/word/2020/wordml/sdtdatahash" xmlns:w16se="http://schemas.microsoft.com/office/word/2015/wordml/symex" xmlns:wpg="http://schemas.microsoft.com/office/word/2010/wordprocessingGroup" xmlns:wpi="http://schemas.microsoft.com/office/word/2010/wordprocessingInk" xmlns:wne="http://schemas.microsoft.com/office/word/2006/wordml" xmlns:wps="http://schemas.microsoft.com/office/word/2010/wordprocessingShape" mc:Ignorable="w14 w15 w16se w16cid w16 w16cex w16sdtdh wp14">
+<w:document xmlns:wpc="http://schemas.microsoft.com/office/word/2010/wordprocessingCanvas" xmlns:cx="http://schemas.microsoft.com/office/drawing/2014/chartex" xmlns:cx1="http://schemas.microsoft.com/office/drawing/2015/9/8/chartex" xmlns:cx2="http://schemas.microsoft.com/office/drawing/2015/10/21/chartex" xmlns:cx3="http://schemas.microsoft.com/office/drawing/2016/5/9/chartex" xmlns:cx4="http://schemas.microsoft.com/office/drawing/2016/5/10/chartex" xmlns:cx5="http://schemas.microsoft.com/office/drawing/2016/5/11/chartex" xmlns:cx6="http://schemas.microsoft.com/office/drawing/2016/5/12/chartex" xmlns:cx7="http://schemas.microsoft.com/office/drawing/2016/5/13/chartex" xmlns:cx8="http://schemas.microsoft.com/office/drawing/2016/5/14/chartex" xmlns:mc="http://schemas.openxmlformats.org/markup-compatibility/2006" xmlns:aink="http://schemas.microsoft.com/office/drawing/2016/ink" xmlns:am3d="http://schemas.microsoft.com/office/drawing/2017/model3d" xmlns:o="urn:schemas-microsoft-com:office:office" xmlns:oel="http://schemas.microsoft.com/office/2019/extlst" xmlns:r="http://schemas.openxmlformats.org/officeDocument/2006/relationships" xmlns:m="http://schemas.openxmlformats.org/officeDocument/2006/math" xmlns:v="urn:schemas-microsoft-com:vml" xmlns:wp14="http://schemas.microsoft.com/office/word/2010/wordprocessingDrawing" xmlns:wp="http://schemas.openxmlformats.org/drawingml/2006/wordprocessingDrawing" xmlns:w10="urn:schemas-microsoft-com:office:word" xmlns:w="http://schemas.openxmlformats.org/wordprocessingml/2006/main" xmlns:w14="http://schemas.microsoft.com/office/word/2010/wordml" xmlns:w15="http://schemas.microsoft.com/office/word/2012/wordml" xmlns:w16cex="http://schemas.microsoft.com/office/word/2018/wordml/cex" xmlns:w16cid="http://schemas.microsoft.com/office/word/2016/wordml/cid" xmlns:w16="http://schemas.microsoft.com/office/word/2018/wordml" xmlns:w16du="http://schemas.microsoft.com/office/word/2023/wordml/word16du" xmlns:w16sdtdh="http://schemas.microsoft.com/office/word/2020/wordml/sdtdatahash" xmlns:w16sdtfl="http://schemas.microsoft.com/office/word/2024/wordml/sdtformatlock" xmlns:w16se="http://schemas.microsoft.com/office/word/2015/wordml/symex" xmlns:wpg="http://schemas.microsoft.com/office/word/2010/wordprocessingGroup" xmlns:wpi="http://schemas.microsoft.com/office/word/2010/wordprocessingInk" xmlns:wne="http://schemas.microsoft.com/office/word/2006/wordml" xmlns:wps="http://schemas.microsoft.com/office/word/2010/wordprocessingShape" mc:Ignorable="w14 w15 w16se w16cid w16 w16cex w16sdtdh w16sdtfl w16du wp14">
   <w:body>
     <w:tbl>
       <w:tblPr>
         <w:tblW w:w="9565" w:type="dxa"/>
         <w:tblInd w:w="-142" w:type="dxa"/>
         <w:tblBorders>
-          <w:top w:val="single" w:color="000000" w:sz="4" w:space="0"/>
-          <w:left w:val="single" w:color="000000" w:sz="4" w:space="0"/>
-          <w:bottom w:val="single" w:color="000000" w:sz="4" w:space="0"/>
-          <w:right w:val="single" w:color="000000" w:sz="4" w:space="0"/>
-          <w:insideH w:val="single" w:color="000000" w:sz="4" w:space="0"/>
-          <w:insideV w:val="single" w:color="000000" w:sz="4" w:space="0"/>
+          <w:top w:val="single" w:sz="4" w:space="0" w:color="000000"/>
+          <w:left w:val="single" w:sz="4" w:space="0" w:color="000000"/>
+          <w:bottom w:val="single" w:sz="4" w:space="0" w:color="000000"/>
+          <w:right w:val="single" w:sz="4" w:space="0" w:color="000000"/>
+          <w:insideH w:val="single" w:sz="4" w:space="0" w:color="000000"/>
+          <w:insideV w:val="single" w:sz="4" w:space="0" w:color="000000"/>
         </w:tblBorders>
         <w:shd w:val="clear" w:color="auto" w:fill="FFFFFF"/>
         <w:tblLayout w:type="fixed"/>
@@ -48,7 +48,7 @@
                 <w:rFonts w:eastAsia="Arial"/>
               </w:rPr>
             </w:pPr>
-            <w:bookmarkStart w:name="_Hlk116390860" w:id="0"/>
+            <w:bookmarkStart w:id="0" w:name="_Hlk116390860"/>
             <w:r>
               <w:rPr>
                 <w:rFonts w:eastAsia="Arial"/>
@@ -112,7 +112,7 @@
                 <w:rFonts w:eastAsia="Arial"/>
               </w:rPr>
             </w:pPr>
-            <w:hyperlink w:history="1" r:id="rId9">
+            <w:hyperlink r:id="rId9" w:history="1">
               <w:r>
                 <w:rPr>
                   <w:rFonts w:eastAsia="Arial"/>
@@ -146,7 +146,7 @@
                 <w:rFonts w:eastAsia="Arial"/>
               </w:rPr>
             </w:pPr>
-            <w:hyperlink w:history="1" r:id="rId10">
+            <w:hyperlink r:id="rId10" w:history="1">
               <w:r>
                 <w:rPr>
                   <w:rFonts w:eastAsia="Arial"/>
@@ -347,7 +347,7 @@
                 <w:highlight w:val="yellow"/>
               </w:rPr>
             </w:pPr>
-            <w:hyperlink r:id="R581dd5e9f4c3488b">
+            <w:hyperlink r:id="rId11">
               <w:r>
                 <w:rPr>
                   <w:rFonts w:eastAsia="Arial"/>
@@ -465,19 +465,34 @@
               <w:rPr>
                 <w:rFonts w:eastAsia="Arial"/>
               </w:rPr>
-              <w:t xml:space="preserve">Pemberitahuan </w:t>
+              <w:t>Pemberitahuan Kelengkapan Data dan Informasi</w:t>
             </w:r>
             <w:r>
               <w:rPr>
                 <w:rFonts w:eastAsia="Arial"/>
-              </w:rPr>
-              <w:t>Kelengkapan Data dan Informasi</w:t>
+                <w:lang w:val="en-US"/>
+              </w:rPr>
+              <w:t xml:space="preserve"> </w:t>
             </w:r>
             <w:r>
               <w:rPr>
                 <w:rFonts w:eastAsia="Arial"/>
                 <w:lang w:val="en-US"/>
               </w:rPr>
+              <w:t xml:space="preserve">Tahun Data </w:t>
+            </w:r>
+            <w:r>
+              <w:rPr>
+                <w:rFonts w:eastAsia="Arial"/>
+                <w:lang w:val="en-US"/>
+              </w:rPr>
+              <w:t>{{tahun_data}}</w:t>
+            </w:r>
+            <w:r>
+              <w:rPr>
+                <w:rFonts w:eastAsia="Arial"/>
+                <w:lang w:val="en-US"/>
+              </w:rPr>
               <w:t xml:space="preserve"> </w:t>
             </w:r>
             <w:r>
@@ -485,23 +500,7 @@
                 <w:rFonts w:eastAsia="Arial"/>
                 <w:lang w:val="en-US"/>
               </w:rPr>
-              <w:t xml:space="preserve">Tahun Data </w:t>
-            </w:r>
-            <w:r>
-              <w:rPr>
-                <w:rFonts w:eastAsia="Arial"/>
-                <w:highlight w:val="yellow"/>
-                <w:lang w:val="en-US"/>
-              </w:rPr>
-              <w:t xml:space="preserve">2024 </w:t>
-            </w:r>
-            <w:r>
-              <w:rPr>
-                <w:rFonts w:eastAsia="Arial"/>
-                <w:highlight w:val="yellow"/>
-                <w:lang w:val="en-US"/>
-              </w:rPr>
-              <w:t>Kabupaten Pemalang</w:t>
+              <w:t>{{nama_ilap}}</w:t>
             </w:r>
           </w:p>
         </w:tc>
@@ -529,22 +528,19 @@
         <w:rPr>
           <w:highlight w:val="yellow"/>
         </w:rPr>
-        <w:t xml:space="preserve">Yth. Kepala Badan Pengelolaan Pendapatan Daerah Kabupaten Pemalang </w:t>
-      </w:r>
-    </w:p>
-    <w:p>
-      <w:pPr>
-        <w:ind w:left="-170" w:right="57"/>
-        <w:jc w:val="both"/>
+        <w:t xml:space="preserve">Yth. Kepala Badan Pengelolaan Pendapatan Daerah </w:t>
+      </w:r>
+      <w:r>
         <w:rPr>
           <w:highlight w:val="yellow"/>
         </w:rPr>
-      </w:pPr>
+        <w:t>{{nama_ilap}}</w:t>
+      </w:r>
       <w:r>
         <w:rPr>
           <w:highlight w:val="yellow"/>
         </w:rPr>
-        <w:t>Jl. Suro Hadikusumo No.1, Kebondalem, Kec. Pemalang</w:t>
+        <w:t xml:space="preserve"> </w:t>
       </w:r>
     </w:p>
     <w:p>
@@ -556,20 +552,7 @@
         <w:rPr>
           <w:highlight w:val="yellow"/>
         </w:rPr>
-        <w:t>Kabupaten Pemalang</w:t>
-      </w:r>
-      <w:r>
-        <w:rPr>
-          <w:highlight w:val="yellow"/>
-          <w:lang w:val="en-US"/>
-        </w:rPr>
-        <w:t xml:space="preserve">, Provinsi </w:t>
-      </w:r>
-      <w:r>
-        <w:rPr>
-          <w:highlight w:val="yellow"/>
-        </w:rPr>
-        <w:t>Jawa Tengah</w:t>
+        <w:t>alamat</w:t>
       </w:r>
     </w:p>
     <w:p>
@@ -594,7 +577,7 @@
         <w:ind w:left="-170" w:right="57" w:firstLine="737"/>
         <w:jc w:val="both"/>
       </w:pPr>
-      <w:bookmarkStart w:name="_Hlk175592941" w:id="1"/>
+      <w:bookmarkStart w:id="1" w:name="_Hlk175592941"/>
       <w:r>
         <w:t xml:space="preserve">Dengan ini diberitahukan bahwa Data dan Informasi yang </w:t>
       </w:r>
@@ -623,12 +606,12 @@
         <w:tblW w:w="0" w:type="auto"/>
         <w:tblInd w:w="-170" w:type="dxa"/>
         <w:tblBorders>
-          <w:top w:val="none" w:color="auto" w:sz="0" w:space="0"/>
-          <w:left w:val="none" w:color="auto" w:sz="0" w:space="0"/>
-          <w:bottom w:val="none" w:color="auto" w:sz="0" w:space="0"/>
-          <w:right w:val="none" w:color="auto" w:sz="0" w:space="0"/>
-          <w:insideH w:val="none" w:color="auto" w:sz="0" w:space="0"/>
-          <w:insideV w:val="none" w:color="auto" w:sz="0" w:space="0"/>
+          <w:top w:val="none" w:sz="0" w:space="0" w:color="auto"/>
+          <w:left w:val="none" w:sz="0" w:space="0" w:color="auto"/>
+          <w:bottom w:val="none" w:sz="0" w:space="0" w:color="auto"/>
+          <w:right w:val="none" w:sz="0" w:space="0" w:color="auto"/>
+          <w:insideH w:val="none" w:sz="0" w:space="0" w:color="auto"/>
+          <w:insideV w:val="none" w:sz="0" w:space="0" w:color="auto"/>
         </w:tblBorders>
         <w:tblLook w:val="04A0" w:firstRow="1" w:lastRow="0" w:firstColumn="1" w:lastColumn="0" w:noHBand="0" w:noVBand="1"/>
       </w:tblPr>
@@ -699,31 +682,18 @@
             </w:pPr>
             <w:r>
               <w:rPr>
-                <w:highlight w:val="yellow"/>
-                <w:lang w:val="en-US"/>
-              </w:rPr>
-              <w:t>(</w:t>
-            </w:r>
-            <w:r>
-              <w:rPr>
-                <w:highlight w:val="yellow"/>
-                <w:lang w:val="en-US"/>
-              </w:rPr>
-              <w:t xml:space="preserve">Silahkan </w:t>
-            </w:r>
-            <w:r>
-              <w:rPr>
-                <w:highlight w:val="yellow"/>
-                <w:lang w:val="en-US"/>
-              </w:rPr>
-              <w:t>ditulis</w:t>
-            </w:r>
-            <w:r>
-              <w:rPr>
-                <w:highlight w:val="yellow"/>
-                <w:lang w:val="en-US"/>
-              </w:rPr>
-              <w:t xml:space="preserve"> “Terlampir” jika terdapat beberapa surat dari satu Pemda)</w:t>
+                <w:lang w:val="en-US"/>
+              </w:rPr>
+              <w:t>{{</w:t>
+            </w:r>
+            <w:r>
+              <w:t>nomor_surat_pengantar</w:t>
+            </w:r>
+            <w:r>
+              <w:rPr>
+                <w:lang w:val="en-US"/>
+              </w:rPr>
+              <w:t>}}</w:t>
             </w:r>
           </w:p>
         </w:tc>
@@ -789,24 +759,18 @@
             </w:pPr>
             <w:r>
               <w:rPr>
-                <w:highlight w:val="yellow"/>
-                <w:lang w:val="en-US"/>
-              </w:rPr>
-              <w:t>(Silahkan di</w:t>
-            </w:r>
-            <w:r>
-              <w:rPr>
-                <w:highlight w:val="yellow"/>
-                <w:lang w:val="en-US"/>
-              </w:rPr>
-              <w:t>tulis</w:t>
-            </w:r>
-            <w:r>
-              <w:rPr>
-                <w:highlight w:val="yellow"/>
-                <w:lang w:val="en-US"/>
-              </w:rPr>
-              <w:t xml:space="preserve"> “Terlampir” jika terdapat beberapa surat dari satu Pemda)</w:t>
+                <w:lang w:val="en-US"/>
+              </w:rPr>
+              <w:t>{{</w:t>
+            </w:r>
+            <w:r>
+              <w:t>tanggal_surat_pengantar</w:t>
+            </w:r>
+            <w:r>
+              <w:rPr>
+                <w:lang w:val="en-US"/>
+              </w:rPr>
+              <w:t>}}</w:t>
             </w:r>
           </w:p>
         </w:tc>
@@ -877,19 +841,22 @@
                 <w:noProof/>
                 <w:lang w:val="en-US"/>
               </w:rPr>
-              <w:t xml:space="preserve">Tahun </w:t>
-            </w:r>
-            <w:r>
-              <w:rPr>
-                <w:lang w:val="en-US"/>
-              </w:rPr>
-              <w:t>…</w:t>
-            </w:r>
-            <w:r>
-              <w:rPr>
-                <w:lang w:val="en-US"/>
-              </w:rPr>
-              <w:t>….</w:t>
+              <w:t>Tahun {{</w:t>
+            </w:r>
+            <w:r>
+              <w:rPr>
+                <w:rFonts w:eastAsia="Arial" w:cs="Arial"/>
+                <w:noProof/>
+              </w:rPr>
+              <w:t>tahun_data</w:t>
+            </w:r>
+            <w:r>
+              <w:rPr>
+                <w:rFonts w:eastAsia="Arial" w:cs="Arial"/>
+                <w:noProof/>
+                <w:lang w:val="en-US"/>
+              </w:rPr>
+              <w:t>}}</w:t>
             </w:r>
           </w:p>
         </w:tc>
@@ -957,7 +924,20 @@
               <w:rPr>
                 <w:lang w:val="en-US"/>
               </w:rPr>
-              <w:t>……………..</w:t>
+              <w:t>{{</w:t>
+            </w:r>
+            <w:r>
+              <w:rPr>
+                <w:rFonts w:eastAsia="Arial" w:cs="Arial"/>
+                <w:noProof/>
+              </w:rPr>
+              <w:t>tanggal_terima_dip</w:t>
+            </w:r>
+            <w:r>
+              <w:rPr>
+                <w:lang w:val="en-US"/>
+              </w:rPr>
+              <w:t>}}</w:t>
             </w:r>
           </w:p>
         </w:tc>
@@ -1022,7 +1002,13 @@
               </w:rPr>
             </w:pPr>
             <w:r>
-              <w:t xml:space="preserve">Langsung </w:t>
+              <w:t>{{</w:t>
+            </w:r>
+            <w:r>
+              <w:t>cara_penyampaian</w:t>
+            </w:r>
+            <w:r>
+              <w:t>}}</w:t>
             </w:r>
           </w:p>
         </w:tc>
@@ -1421,12 +1407,12 @@
         <w:tblW w:w="5158" w:type="pct"/>
         <w:tblInd w:w="-289" w:type="dxa"/>
         <w:tblBorders>
-          <w:top w:val="single" w:color="FFFFFF" w:sz="4" w:space="0"/>
-          <w:left w:val="single" w:color="FFFFFF" w:sz="4" w:space="0"/>
-          <w:bottom w:val="single" w:color="FFFFFF" w:sz="4" w:space="0"/>
-          <w:right w:val="single" w:color="FFFFFF" w:sz="4" w:space="0"/>
-          <w:insideH w:val="single" w:color="FFFFFF" w:sz="4" w:space="0"/>
-          <w:insideV w:val="single" w:color="FFFFFF" w:sz="4" w:space="0"/>
+          <w:top w:val="single" w:sz="4" w:space="0" w:color="FFFFFF"/>
+          <w:left w:val="single" w:sz="4" w:space="0" w:color="FFFFFF"/>
+          <w:bottom w:val="single" w:sz="4" w:space="0" w:color="FFFFFF"/>
+          <w:right w:val="single" w:sz="4" w:space="0" w:color="FFFFFF"/>
+          <w:insideH w:val="single" w:sz="4" w:space="0" w:color="FFFFFF"/>
+          <w:insideV w:val="single" w:sz="4" w:space="0" w:color="FFFFFF"/>
         </w:tblBorders>
         <w:shd w:val="clear" w:color="auto" w:fill="FFFFFF"/>
         <w:tblLook w:val="04A0" w:firstRow="1" w:lastRow="0" w:firstColumn="1" w:lastColumn="0" w:noHBand="0" w:noVBand="1"/>
@@ -1453,7 +1439,7 @@
                 <w:lang w:val="en-GB"/>
               </w:rPr>
             </w:pPr>
-            <w:hyperlink w:history="1" r:id="rId12">
+            <w:hyperlink r:id="rId12" w:history="1">
               <w:r>
                 <w:rPr>
                   <w:rStyle w:val="Hyperlink"/>
@@ -1481,7 +1467,7 @@
             <w:r>
               <w:t>Direktur Data dan Informasi Perpajakan</w:t>
             </w:r>
-            <w:hyperlink w:history="1" r:id="rId13">
+            <w:hyperlink r:id="rId13" w:history="1">
               <w:r>
                 <w:rPr>
                   <w:rStyle w:val="Hyperlink"/>
@@ -1626,29 +1612,8 @@
                 <w:lang w:val="en-US"/>
               </w:rPr>
             </w:pPr>
-            <w:hyperlink w:history="1" r:id="rId14">
-              <w:r>
-                <w:rPr>
-                  <w:rStyle w:val="Hyperlink"/>
-                  <w:rFonts w:cs="Arial"/>
-                  <w:noProof/>
-                  <w:color w:val="auto"/>
-                  <w:u w:val="none"/>
-                  <w:lang w:val="en-US"/>
-                </w:rPr>
-                <w:t>Max</w:t>
-              </w:r>
-            </w:hyperlink>
-            <w:r>
-              <w:rPr>
-                <w:rStyle w:val="Hyperlink"/>
-                <w:rFonts w:cs="Arial"/>
-                <w:noProof/>
-                <w:color w:val="auto"/>
-                <w:u w:val="none"/>
-                <w:lang w:val="en-US"/>
-              </w:rPr>
-              <w:t xml:space="preserve"> Darmawan</w:t>
+            <w:r>
+              <w:t>Eddy Wahyudi</w:t>
             </w:r>
           </w:p>
         </w:tc>
@@ -1669,12 +1634,12 @@
         <w:tblW w:w="5153" w:type="pct"/>
         <w:tblInd w:w="-284" w:type="dxa"/>
         <w:tblBorders>
-          <w:top w:val="single" w:color="000000" w:sz="4" w:space="0"/>
-          <w:left w:val="single" w:color="000000" w:sz="4" w:space="0"/>
-          <w:bottom w:val="single" w:color="000000" w:sz="4" w:space="0"/>
-          <w:right w:val="single" w:color="000000" w:sz="4" w:space="0"/>
-          <w:insideH w:val="single" w:color="000000" w:sz="4" w:space="0"/>
-          <w:insideV w:val="single" w:color="000000" w:sz="4" w:space="0"/>
+          <w:top w:val="single" w:sz="4" w:space="0" w:color="000000"/>
+          <w:left w:val="single" w:sz="4" w:space="0" w:color="000000"/>
+          <w:bottom w:val="single" w:sz="4" w:space="0" w:color="000000"/>
+          <w:right w:val="single" w:sz="4" w:space="0" w:color="000000"/>
+          <w:insideH w:val="single" w:sz="4" w:space="0" w:color="000000"/>
+          <w:insideV w:val="single" w:sz="4" w:space="0" w:color="000000"/>
         </w:tblBorders>
         <w:shd w:val="clear" w:color="auto" w:fill="FFFFFF"/>
         <w:tblLook w:val="04A0" w:firstRow="1" w:lastRow="0" w:firstColumn="1" w:lastColumn="0" w:noHBand="0" w:noVBand="1"/>
@@ -1726,7 +1691,7 @@
                 <w:rFonts w:eastAsia="Arial"/>
               </w:rPr>
             </w:pPr>
-            <w:hyperlink w:history="1" r:id="rId15">
+            <w:hyperlink r:id="rId14" w:history="1">
               <w:r>
                 <w:rPr>
                   <w:rStyle w:val="Hyperlink"/>
@@ -1747,24 +1712,22 @@
           <w:szCs w:val="20"/>
         </w:rPr>
       </w:pPr>
-      <w:bookmarkStart w:name="_Hlk176870149" w:id="2"/>
-      <w:bookmarkStart w:name="_Hlk175592966" w:id="3"/>
+      <w:bookmarkStart w:id="2" w:name="_Hlk175592966"/>
+      <w:bookmarkStart w:id="3" w:name="_Hlk176870149"/>
       <w:bookmarkEnd w:id="0"/>
       <w:r>
         <w:rPr>
           <w:sz w:val="20"/>
           <w:szCs w:val="20"/>
         </w:rPr>
+        <w:lastRenderedPageBreak/>
         <w:t xml:space="preserve">Lampiran </w:t>
       </w:r>
     </w:p>
     <w:p>
       <w:pPr>
-        <w:pStyle w:val="Normal"/>
-        <w:suppressLineNumbers w:val="0"/>
-        <w:bidi w:val="0"/>
-        <w:spacing w:before="0" w:beforeAutospacing="off" w:after="0" w:afterAutospacing="off" w:line="259" w:lineRule="auto"/>
-        <w:ind w:left="5245" w:right="0"/>
+        <w:spacing w:line="259" w:lineRule="auto"/>
+        <w:ind w:left="5245"/>
         <w:jc w:val="both"/>
       </w:pPr>
       <w:r>
@@ -1913,10 +1876,9 @@
       <w:r>
         <w:rPr>
           <w:rFonts w:cs="Arial"/>
-          <w:highlight w:val="yellow"/>
           <w:lang w:val="en-US"/>
         </w:rPr>
-        <w:t>Kabupaten Pemalang</w:t>
+        <w:t>{{nama_ilap}}</w:t>
       </w:r>
     </w:p>
     <w:p>
@@ -1938,11 +1900,11 @@
         <w:tblLook w:val="04A0" w:firstRow="1" w:lastRow="0" w:firstColumn="1" w:lastColumn="0" w:noHBand="0" w:noVBand="1"/>
       </w:tblPr>
       <w:tblGrid>
-        <w:gridCol w:w="582"/>
-        <w:gridCol w:w="4358"/>
-        <w:gridCol w:w="1110"/>
-        <w:gridCol w:w="1605"/>
-        <w:gridCol w:w="1843"/>
+        <w:gridCol w:w="1272"/>
+        <w:gridCol w:w="1804"/>
+        <w:gridCol w:w="1794"/>
+        <w:gridCol w:w="2480"/>
+        <w:gridCol w:w="2283"/>
       </w:tblGrid>
       <w:tr>
         <w:trPr>
@@ -1953,10 +1915,10 @@
           <w:tcPr>
             <w:tcW w:w="582" w:type="dxa"/>
             <w:tcBorders>
-              <w:top w:val="single" w:color="auto" w:sz="4" w:space="0"/>
-              <w:left w:val="single" w:color="auto" w:sz="4" w:space="0"/>
-              <w:bottom w:val="single" w:color="auto" w:sz="4" w:space="0"/>
-              <w:right w:val="single" w:color="auto" w:sz="4" w:space="0"/>
+              <w:top w:val="single" w:sz="4" w:space="0" w:color="auto"/>
+              <w:left w:val="single" w:sz="4" w:space="0" w:color="auto"/>
+              <w:bottom w:val="single" w:sz="4" w:space="0" w:color="auto"/>
+              <w:right w:val="single" w:sz="4" w:space="0" w:color="auto"/>
             </w:tcBorders>
             <w:shd w:val="clear" w:color="auto" w:fill="D0CECE" w:themeFill="background2" w:themeFillShade="E6"/>
             <w:vAlign w:val="center"/>
@@ -1991,10 +1953,10 @@
           <w:tcPr>
             <w:tcW w:w="4358" w:type="dxa"/>
             <w:tcBorders>
-              <w:top w:val="single" w:color="auto" w:sz="4" w:space="0"/>
+              <w:top w:val="single" w:sz="4" w:space="0" w:color="auto"/>
               <w:left w:val="nil"/>
-              <w:bottom w:val="single" w:color="auto" w:sz="4" w:space="0"/>
-              <w:right w:val="single" w:color="auto" w:sz="4" w:space="0"/>
+              <w:bottom w:val="single" w:sz="4" w:space="0" w:color="auto"/>
+              <w:right w:val="single" w:sz="4" w:space="0" w:color="auto"/>
             </w:tcBorders>
             <w:shd w:val="clear" w:color="auto" w:fill="D0CECE" w:themeFill="background2" w:themeFillShade="E6"/>
             <w:vAlign w:val="center"/>
@@ -2029,10 +1991,10 @@
           <w:tcPr>
             <w:tcW w:w="1110" w:type="dxa"/>
             <w:tcBorders>
-              <w:top w:val="single" w:color="auto" w:sz="4" w:space="0"/>
+              <w:top w:val="single" w:sz="4" w:space="0" w:color="auto"/>
               <w:left w:val="nil"/>
-              <w:bottom w:val="single" w:color="auto" w:sz="4" w:space="0"/>
-              <w:right w:val="single" w:color="auto" w:sz="4" w:space="0"/>
+              <w:bottom w:val="single" w:sz="4" w:space="0" w:color="auto"/>
+              <w:right w:val="single" w:sz="4" w:space="0" w:color="auto"/>
             </w:tcBorders>
             <w:shd w:val="clear" w:color="auto" w:fill="D0CECE" w:themeFill="background2" w:themeFillShade="E6"/>
             <w:vAlign w:val="center"/>
@@ -2067,10 +2029,10 @@
           <w:tcPr>
             <w:tcW w:w="1605" w:type="dxa"/>
             <w:tcBorders>
-              <w:top w:val="single" w:color="auto" w:sz="4" w:space="0"/>
+              <w:top w:val="single" w:sz="4" w:space="0" w:color="auto"/>
               <w:left w:val="nil"/>
-              <w:bottom w:val="single" w:color="auto" w:sz="4" w:space="0"/>
-              <w:right w:val="single" w:color="auto" w:sz="4" w:space="0"/>
+              <w:bottom w:val="single" w:sz="4" w:space="0" w:color="auto"/>
+              <w:right w:val="single" w:sz="4" w:space="0" w:color="auto"/>
             </w:tcBorders>
             <w:shd w:val="clear" w:color="auto" w:fill="D0CECE" w:themeFill="background2" w:themeFillShade="E6"/>
             <w:vAlign w:val="center"/>
@@ -2116,10 +2078,10 @@
           <w:tcPr>
             <w:tcW w:w="1843" w:type="dxa"/>
             <w:tcBorders>
-              <w:top w:val="single" w:color="auto" w:sz="4" w:space="0"/>
+              <w:top w:val="single" w:sz="4" w:space="0" w:color="auto"/>
               <w:left w:val="nil"/>
-              <w:bottom w:val="single" w:color="auto" w:sz="4" w:space="0"/>
-              <w:right w:val="single" w:color="auto" w:sz="4" w:space="0"/>
+              <w:bottom w:val="single" w:sz="4" w:space="0" w:color="auto"/>
+              <w:right w:val="single" w:sz="4" w:space="0" w:color="auto"/>
             </w:tcBorders>
             <w:shd w:val="clear" w:color="auto" w:fill="D0CECE" w:themeFill="background2" w:themeFillShade="E6"/>
             <w:vAlign w:val="center"/>
@@ -2159,13 +2121,10 @@
             <w:tcW w:w="582" w:type="dxa"/>
             <w:tcBorders>
               <w:top w:val="nil"/>
-              <w:left w:val="single" w:color="auto" w:sz="4" w:space="0"/>
-              <w:bottom w:val="single" w:color="auto" w:sz="4" w:space="0"/>
-              <w:right w:val="single" w:color="auto" w:sz="4" w:space="0"/>
+              <w:left w:val="single" w:sz="4" w:space="0" w:color="auto"/>
+              <w:bottom w:val="single" w:sz="4" w:space="0" w:color="auto"/>
+              <w:right w:val="single" w:sz="4" w:space="0" w:color="auto"/>
             </w:tcBorders>
-            <w:shd w:val="clear" w:color="auto" w:fill="auto"/>
-            <w:vAlign w:val="center"/>
-            <w:hideMark/>
           </w:tcPr>
           <w:p>
             <w:pPr>
@@ -2179,10 +2138,11 @@
             <w:r>
               <w:rPr>
                 <w:rFonts w:eastAsia="Times New Roman" w:cs="Arial"/>
-                <w:highlight w:val="yellow"/>
+                <w:sz w:val="24"/>
+                <w:szCs w:val="24"/>
                 <w:lang w:val="en-ID" w:eastAsia="en-ID"/>
               </w:rPr>
-              <w:t>1</w:t>
+              <w:t>{{row.nomor}}</w:t>
             </w:r>
           </w:p>
         </w:tc>
@@ -2192,11 +2152,9 @@
             <w:tcBorders>
               <w:top w:val="nil"/>
               <w:left w:val="nil"/>
-              <w:bottom w:val="single" w:color="auto" w:sz="4" w:space="0"/>
-              <w:right w:val="single" w:color="auto" w:sz="4" w:space="0"/>
+              <w:bottom w:val="single" w:sz="4" w:space="0" w:color="auto"/>
+              <w:right w:val="single" w:sz="4" w:space="0" w:color="auto"/>
             </w:tcBorders>
-            <w:shd w:val="clear" w:color="auto" w:fill="auto"/>
-            <w:vAlign w:val="center"/>
           </w:tcPr>
           <w:p>
             <w:pPr>
@@ -2209,10 +2167,11 @@
             </w:pPr>
             <w:r>
               <w:rPr>
-                <w:rFonts w:cs="Arial"/>
-                <w:highlight w:val="yellow"/>
-              </w:rPr>
-              <w:t>Data Kepemilikan Hotel/Penginapan</w:t>
+                <w:rFonts w:eastAsia="Times New Roman" w:cs="Arial"/>
+                <w:color w:val="auto"/>
+                <w:lang w:val="en-US" w:eastAsia="en-ID"/>
+              </w:rPr>
+              <w:t>{{row.sub_jenis_data}}</w:t>
             </w:r>
           </w:p>
         </w:tc>
@@ -2222,11 +2181,9 @@
             <w:tcBorders>
               <w:top w:val="nil"/>
               <w:left w:val="nil"/>
-              <w:bottom w:val="single" w:color="auto" w:sz="4" w:space="0"/>
-              <w:right w:val="single" w:color="auto" w:sz="4" w:space="0"/>
+              <w:bottom w:val="single" w:sz="4" w:space="0" w:color="auto"/>
+              <w:right w:val="single" w:sz="4" w:space="0" w:color="auto"/>
             </w:tcBorders>
-            <w:shd w:val="clear" w:color="auto" w:fill="auto"/>
-            <w:vAlign w:val="center"/>
           </w:tcPr>
           <w:p>
             <w:pPr>
@@ -2239,18 +2196,12 @@
             </w:pPr>
             <w:r>
               <w:rPr>
-                <w:rFonts w:cs="Arial"/>
-                <w:highlight w:val="yellow"/>
-              </w:rPr>
-              <w:t>202</w:t>
-            </w:r>
-            <w:r>
-              <w:rPr>
-                <w:rFonts w:cs="Arial"/>
-                <w:highlight w:val="yellow"/>
-                <w:lang w:val="en-US"/>
-              </w:rPr>
-              <w:t>4</w:t>
+                <w:rFonts w:eastAsia="Times New Roman" w:cs="Arial"/>
+                <w:sz w:val="24"/>
+                <w:szCs w:val="24"/>
+                <w:lang w:val="en-US" w:eastAsia="en-ID"/>
+              </w:rPr>
+              <w:t>{{row.periode_data}}</w:t>
             </w:r>
           </w:p>
         </w:tc>
@@ -2260,11 +2211,9 @@
             <w:tcBorders>
               <w:top w:val="nil"/>
               <w:left w:val="nil"/>
-              <w:bottom w:val="single" w:color="auto" w:sz="4" w:space="0"/>
-              <w:right w:val="single" w:color="auto" w:sz="4" w:space="0"/>
+              <w:bottom w:val="single" w:sz="4" w:space="0" w:color="auto"/>
+              <w:right w:val="single" w:sz="4" w:space="0" w:color="auto"/>
             </w:tcBorders>
-            <w:shd w:val="clear" w:color="auto" w:fill="auto"/>
-            <w:vAlign w:val="center"/>
           </w:tcPr>
           <w:p>
             <w:pPr>
@@ -2277,11 +2226,12 @@
             </w:pPr>
             <w:r>
               <w:rPr>
-                <w:rFonts w:cs="Arial"/>
-                <w:highlight w:val="yellow"/>
-                <w:lang w:val="en-US"/>
-              </w:rPr>
-              <w:t>100</w:t>
+                <w:rFonts w:eastAsia="Times New Roman" w:cs="Arial"/>
+                <w:sz w:val="24"/>
+                <w:szCs w:val="24"/>
+                <w:lang w:val="en-US" w:eastAsia="en-ID"/>
+              </w:rPr>
+              <w:t>{{row.jumlah_baris_diterima}}</w:t>
             </w:r>
           </w:p>
         </w:tc>
@@ -2291,10 +2241,9 @@
             <w:tcBorders>
               <w:top w:val="nil"/>
               <w:left w:val="nil"/>
-              <w:bottom w:val="single" w:color="auto" w:sz="4" w:space="0"/>
-              <w:right w:val="single" w:color="auto" w:sz="4" w:space="0"/>
+              <w:bottom w:val="single" w:sz="4" w:space="0" w:color="auto"/>
+              <w:right w:val="single" w:sz="4" w:space="0" w:color="auto"/>
             </w:tcBorders>
-            <w:vAlign w:val="center"/>
           </w:tcPr>
           <w:p>
             <w:pPr>
@@ -2308,518 +2257,13 @@
             <w:r>
               <w:rPr>
                 <w:rFonts w:cs="Arial"/>
-                <w:highlight w:val="yellow"/>
-                <w:lang w:val="en-US"/>
-              </w:rPr>
-              <w:t>100</w:t>
+              </w:rPr>
+              <w:t>{{row.jumlah_baris_lengkap}}</w:t>
             </w:r>
           </w:p>
         </w:tc>
       </w:tr>
-      <w:tr>
-        <w:trPr>
-          <w:trHeight w:val="386"/>
-        </w:trPr>
-        <w:tc>
-          <w:tcPr>
-            <w:tcW w:w="582" w:type="dxa"/>
-            <w:tcBorders>
-              <w:top w:val="single" w:color="auto" w:sz="4" w:space="0"/>
-              <w:left w:val="single" w:color="auto" w:sz="4" w:space="0"/>
-              <w:bottom w:val="single" w:color="auto" w:sz="4" w:space="0"/>
-              <w:right w:val="single" w:color="auto" w:sz="4" w:space="0"/>
-            </w:tcBorders>
-            <w:shd w:val="clear" w:color="auto" w:fill="auto"/>
-            <w:vAlign w:val="center"/>
-          </w:tcPr>
-          <w:p>
-            <w:pPr>
-              <w:jc w:val="center"/>
-              <w:rPr>
-                <w:rFonts w:eastAsia="Times New Roman" w:cs="Arial"/>
-                <w:highlight w:val="yellow"/>
-                <w:lang w:val="en-ID" w:eastAsia="en-ID"/>
-              </w:rPr>
-            </w:pPr>
-            <w:r>
-              <w:rPr>
-                <w:rFonts w:eastAsia="Times New Roman" w:cs="Arial"/>
-                <w:highlight w:val="yellow"/>
-                <w:lang w:val="en-ID" w:eastAsia="en-ID"/>
-              </w:rPr>
-              <w:t>2</w:t>
-            </w:r>
-          </w:p>
-        </w:tc>
-        <w:tc>
-          <w:tcPr>
-            <w:tcW w:w="4358" w:type="dxa"/>
-            <w:tcBorders>
-              <w:top w:val="single" w:color="auto" w:sz="4" w:space="0"/>
-              <w:left w:val="nil"/>
-              <w:bottom w:val="single" w:color="auto" w:sz="4" w:space="0"/>
-              <w:right w:val="single" w:color="auto" w:sz="4" w:space="0"/>
-            </w:tcBorders>
-            <w:shd w:val="clear" w:color="auto" w:fill="auto"/>
-            <w:vAlign w:val="center"/>
-          </w:tcPr>
-          <w:p>
-            <w:pPr>
-              <w:rPr>
-                <w:rFonts w:cs="Arial"/>
-                <w:highlight w:val="yellow"/>
-              </w:rPr>
-            </w:pPr>
-            <w:r>
-              <w:rPr>
-                <w:rFonts w:cs="Arial"/>
-                <w:highlight w:val="yellow"/>
-              </w:rPr>
-              <w:t>Data Kepemilikan Restoran</w:t>
-            </w:r>
-          </w:p>
-        </w:tc>
-        <w:tc>
-          <w:tcPr>
-            <w:tcW w:w="1110" w:type="dxa"/>
-            <w:tcBorders>
-              <w:top w:val="single" w:color="auto" w:sz="4" w:space="0"/>
-              <w:left w:val="nil"/>
-              <w:bottom w:val="single" w:color="auto" w:sz="4" w:space="0"/>
-              <w:right w:val="single" w:color="auto" w:sz="4" w:space="0"/>
-            </w:tcBorders>
-            <w:shd w:val="clear" w:color="auto" w:fill="auto"/>
-            <w:vAlign w:val="center"/>
-          </w:tcPr>
-          <w:p>
-            <w:pPr>
-              <w:jc w:val="center"/>
-              <w:rPr>
-                <w:rFonts w:cs="Arial"/>
-                <w:highlight w:val="yellow"/>
-              </w:rPr>
-            </w:pPr>
-            <w:r>
-              <w:rPr>
-                <w:rFonts w:cs="Arial"/>
-                <w:highlight w:val="yellow"/>
-              </w:rPr>
-              <w:t>202</w:t>
-            </w:r>
-            <w:r>
-              <w:rPr>
-                <w:rFonts w:cs="Arial"/>
-                <w:highlight w:val="yellow"/>
-                <w:lang w:val="en-US"/>
-              </w:rPr>
-              <w:t>4</w:t>
-            </w:r>
-          </w:p>
-        </w:tc>
-        <w:tc>
-          <w:tcPr>
-            <w:tcW w:w="1605" w:type="dxa"/>
-            <w:tcBorders>
-              <w:top w:val="single" w:color="auto" w:sz="4" w:space="0"/>
-              <w:left w:val="nil"/>
-              <w:bottom w:val="single" w:color="auto" w:sz="4" w:space="0"/>
-              <w:right w:val="single" w:color="auto" w:sz="4" w:space="0"/>
-            </w:tcBorders>
-            <w:shd w:val="clear" w:color="auto" w:fill="auto"/>
-            <w:vAlign w:val="center"/>
-          </w:tcPr>
-          <w:p>
-            <w:pPr>
-              <w:jc w:val="center"/>
-              <w:rPr>
-                <w:rFonts w:cs="Arial"/>
-                <w:highlight w:val="yellow"/>
-                <w:lang w:val="en-US"/>
-              </w:rPr>
-            </w:pPr>
-            <w:r>
-              <w:rPr>
-                <w:rFonts w:cs="Arial"/>
-                <w:highlight w:val="yellow"/>
-                <w:lang w:val="en-US"/>
-              </w:rPr>
-              <w:t>500</w:t>
-            </w:r>
-          </w:p>
-        </w:tc>
-        <w:tc>
-          <w:tcPr>
-            <w:tcW w:w="1843" w:type="dxa"/>
-            <w:tcBorders>
-              <w:top w:val="single" w:color="auto" w:sz="4" w:space="0"/>
-              <w:left w:val="nil"/>
-              <w:bottom w:val="single" w:color="auto" w:sz="4" w:space="0"/>
-              <w:right w:val="single" w:color="auto" w:sz="4" w:space="0"/>
-            </w:tcBorders>
-            <w:vAlign w:val="center"/>
-          </w:tcPr>
-          <w:p>
-            <w:pPr>
-              <w:jc w:val="center"/>
-              <w:rPr>
-                <w:rFonts w:cs="Arial"/>
-                <w:highlight w:val="yellow"/>
-                <w:lang w:val="en-US"/>
-              </w:rPr>
-            </w:pPr>
-            <w:r>
-              <w:rPr>
-                <w:rFonts w:cs="Arial"/>
-                <w:highlight w:val="yellow"/>
-                <w:lang w:val="en-US"/>
-              </w:rPr>
-              <w:t>5</w:t>
-            </w:r>
-            <w:r>
-              <w:rPr>
-                <w:rFonts w:cs="Arial"/>
-                <w:highlight w:val="yellow"/>
-                <w:lang w:val="en-US"/>
-              </w:rPr>
-              <w:t>00</w:t>
-            </w:r>
-          </w:p>
-        </w:tc>
-      </w:tr>
-      <w:tr>
-        <w:trPr>
-          <w:trHeight w:val="386"/>
-        </w:trPr>
-        <w:tc>
-          <w:tcPr>
-            <w:tcW w:w="582" w:type="dxa"/>
-            <w:tcBorders>
-              <w:top w:val="single" w:color="auto" w:sz="4" w:space="0"/>
-              <w:left w:val="single" w:color="auto" w:sz="4" w:space="0"/>
-              <w:bottom w:val="single" w:color="auto" w:sz="4" w:space="0"/>
-              <w:right w:val="single" w:color="auto" w:sz="4" w:space="0"/>
-            </w:tcBorders>
-            <w:shd w:val="clear" w:color="auto" w:fill="auto"/>
-            <w:vAlign w:val="center"/>
-          </w:tcPr>
-          <w:p>
-            <w:pPr>
-              <w:jc w:val="center"/>
-              <w:rPr>
-                <w:rFonts w:eastAsia="Times New Roman" w:cs="Arial"/>
-                <w:highlight w:val="yellow"/>
-                <w:lang w:val="en-ID" w:eastAsia="en-ID"/>
-              </w:rPr>
-            </w:pPr>
-            <w:r>
-              <w:rPr>
-                <w:rFonts w:eastAsia="Times New Roman" w:cs="Arial"/>
-                <w:highlight w:val="yellow"/>
-                <w:lang w:val="en-ID" w:eastAsia="en-ID"/>
-              </w:rPr>
-              <w:t>3</w:t>
-            </w:r>
-          </w:p>
-        </w:tc>
-        <w:tc>
-          <w:tcPr>
-            <w:tcW w:w="4358" w:type="dxa"/>
-            <w:tcBorders>
-              <w:top w:val="single" w:color="auto" w:sz="4" w:space="0"/>
-              <w:left w:val="nil"/>
-              <w:bottom w:val="single" w:color="auto" w:sz="4" w:space="0"/>
-              <w:right w:val="single" w:color="auto" w:sz="4" w:space="0"/>
-            </w:tcBorders>
-            <w:shd w:val="clear" w:color="auto" w:fill="auto"/>
-            <w:vAlign w:val="center"/>
-          </w:tcPr>
-          <w:p>
-            <w:pPr>
-              <w:rPr>
-                <w:rFonts w:cs="Arial"/>
-                <w:highlight w:val="yellow"/>
-              </w:rPr>
-            </w:pPr>
-            <w:r>
-              <w:rPr>
-                <w:rFonts w:cs="Arial"/>
-                <w:highlight w:val="yellow"/>
-              </w:rPr>
-              <w:t>Data Izin Mendirikan Bangunan (I</w:t>
-            </w:r>
-            <w:r>
-              <w:rPr>
-                <w:rFonts w:cs="Arial"/>
-                <w:highlight w:val="yellow"/>
-                <w:lang w:val="en-US"/>
-              </w:rPr>
-              <w:t>MB</w:t>
-            </w:r>
-            <w:r>
-              <w:rPr>
-                <w:rFonts w:cs="Arial"/>
-                <w:highlight w:val="yellow"/>
-              </w:rPr>
-              <w:t>)</w:t>
-            </w:r>
-          </w:p>
-        </w:tc>
-        <w:tc>
-          <w:tcPr>
-            <w:tcW w:w="1110" w:type="dxa"/>
-            <w:tcBorders>
-              <w:top w:val="single" w:color="auto" w:sz="4" w:space="0"/>
-              <w:left w:val="nil"/>
-              <w:bottom w:val="single" w:color="auto" w:sz="4" w:space="0"/>
-              <w:right w:val="single" w:color="auto" w:sz="4" w:space="0"/>
-            </w:tcBorders>
-            <w:shd w:val="clear" w:color="auto" w:fill="auto"/>
-            <w:vAlign w:val="center"/>
-          </w:tcPr>
-          <w:p>
-            <w:pPr>
-              <w:jc w:val="center"/>
-              <w:rPr>
-                <w:rFonts w:cs="Arial"/>
-                <w:highlight w:val="yellow"/>
-              </w:rPr>
-            </w:pPr>
-            <w:r>
-              <w:rPr>
-                <w:rFonts w:cs="Arial"/>
-                <w:highlight w:val="yellow"/>
-              </w:rPr>
-              <w:t>202</w:t>
-            </w:r>
-            <w:r>
-              <w:rPr>
-                <w:rFonts w:cs="Arial"/>
-                <w:highlight w:val="yellow"/>
-                <w:lang w:val="en-US"/>
-              </w:rPr>
-              <w:t>4</w:t>
-            </w:r>
-          </w:p>
-        </w:tc>
-        <w:tc>
-          <w:tcPr>
-            <w:tcW w:w="1605" w:type="dxa"/>
-            <w:tcBorders>
-              <w:top w:val="single" w:color="auto" w:sz="4" w:space="0"/>
-              <w:left w:val="nil"/>
-              <w:bottom w:val="single" w:color="auto" w:sz="4" w:space="0"/>
-              <w:right w:val="single" w:color="auto" w:sz="4" w:space="0"/>
-            </w:tcBorders>
-            <w:shd w:val="clear" w:color="auto" w:fill="auto"/>
-            <w:vAlign w:val="center"/>
-          </w:tcPr>
-          <w:p>
-            <w:pPr>
-              <w:jc w:val="center"/>
-              <w:rPr>
-                <w:rFonts w:cs="Arial"/>
-                <w:highlight w:val="yellow"/>
-                <w:lang w:val="en-US"/>
-              </w:rPr>
-            </w:pPr>
-            <w:r>
-              <w:rPr>
-                <w:rFonts w:cs="Arial"/>
-                <w:highlight w:val="yellow"/>
-                <w:lang w:val="en-US"/>
-              </w:rPr>
-              <w:t>657</w:t>
-            </w:r>
-          </w:p>
-        </w:tc>
-        <w:tc>
-          <w:tcPr>
-            <w:tcW w:w="1843" w:type="dxa"/>
-            <w:tcBorders>
-              <w:top w:val="single" w:color="auto" w:sz="4" w:space="0"/>
-              <w:left w:val="nil"/>
-              <w:bottom w:val="single" w:color="auto" w:sz="4" w:space="0"/>
-              <w:right w:val="single" w:color="auto" w:sz="4" w:space="0"/>
-            </w:tcBorders>
-            <w:vAlign w:val="center"/>
-          </w:tcPr>
-          <w:p>
-            <w:pPr>
-              <w:jc w:val="center"/>
-              <w:rPr>
-                <w:rFonts w:cs="Arial"/>
-                <w:highlight w:val="yellow"/>
-                <w:lang w:val="en-US"/>
-              </w:rPr>
-            </w:pPr>
-            <w:r>
-              <w:rPr>
-                <w:rFonts w:cs="Arial"/>
-                <w:highlight w:val="yellow"/>
-                <w:lang w:val="en-US"/>
-              </w:rPr>
-              <w:t>657</w:t>
-            </w:r>
-          </w:p>
-        </w:tc>
-      </w:tr>
-      <w:tr>
-        <w:trPr>
-          <w:trHeight w:val="386"/>
-        </w:trPr>
-        <w:tc>
-          <w:tcPr>
-            <w:tcW w:w="582" w:type="dxa"/>
-            <w:tcBorders>
-              <w:top w:val="single" w:color="auto" w:sz="4" w:space="0"/>
-              <w:left w:val="single" w:color="auto" w:sz="4" w:space="0"/>
-              <w:bottom w:val="single" w:color="auto" w:sz="4" w:space="0"/>
-              <w:right w:val="single" w:color="auto" w:sz="4" w:space="0"/>
-            </w:tcBorders>
-            <w:shd w:val="clear" w:color="auto" w:fill="auto"/>
-            <w:vAlign w:val="center"/>
-          </w:tcPr>
-          <w:p>
-            <w:pPr>
-              <w:jc w:val="center"/>
-              <w:rPr>
-                <w:rFonts w:eastAsia="Times New Roman" w:cs="Arial"/>
-                <w:highlight w:val="yellow"/>
-                <w:lang w:val="en-ID" w:eastAsia="en-ID"/>
-              </w:rPr>
-            </w:pPr>
-            <w:r>
-              <w:rPr>
-                <w:rFonts w:eastAsia="Times New Roman" w:cs="Arial"/>
-                <w:highlight w:val="yellow"/>
-                <w:lang w:val="en-ID" w:eastAsia="en-ID"/>
-              </w:rPr>
-              <w:t>4</w:t>
-            </w:r>
-          </w:p>
-        </w:tc>
-        <w:tc>
-          <w:tcPr>
-            <w:tcW w:w="4358" w:type="dxa"/>
-            <w:tcBorders>
-              <w:top w:val="single" w:color="auto" w:sz="4" w:space="0"/>
-              <w:left w:val="nil"/>
-              <w:bottom w:val="single" w:color="auto" w:sz="4" w:space="0"/>
-              <w:right w:val="single" w:color="auto" w:sz="4" w:space="0"/>
-            </w:tcBorders>
-            <w:shd w:val="clear" w:color="auto" w:fill="auto"/>
-            <w:vAlign w:val="center"/>
-          </w:tcPr>
-          <w:p>
-            <w:pPr>
-              <w:rPr>
-                <w:rFonts w:cs="Arial"/>
-                <w:highlight w:val="yellow"/>
-              </w:rPr>
-            </w:pPr>
-            <w:r>
-              <w:rPr>
-                <w:rFonts w:cs="Arial"/>
-                <w:highlight w:val="yellow"/>
-              </w:rPr>
-              <w:t>Data Surat Izin Usaha</w:t>
-            </w:r>
-          </w:p>
-        </w:tc>
-        <w:tc>
-          <w:tcPr>
-            <w:tcW w:w="1110" w:type="dxa"/>
-            <w:tcBorders>
-              <w:top w:val="single" w:color="auto" w:sz="4" w:space="0"/>
-              <w:left w:val="nil"/>
-              <w:bottom w:val="single" w:color="auto" w:sz="4" w:space="0"/>
-              <w:right w:val="single" w:color="auto" w:sz="4" w:space="0"/>
-            </w:tcBorders>
-            <w:shd w:val="clear" w:color="auto" w:fill="auto"/>
-            <w:vAlign w:val="center"/>
-          </w:tcPr>
-          <w:p>
-            <w:pPr>
-              <w:jc w:val="center"/>
-              <w:rPr>
-                <w:rFonts w:cs="Arial"/>
-                <w:highlight w:val="yellow"/>
-                <w:lang w:val="en-US"/>
-              </w:rPr>
-            </w:pPr>
-            <w:r>
-              <w:rPr>
-                <w:rFonts w:cs="Arial"/>
-                <w:highlight w:val="yellow"/>
-                <w:lang w:val="en-US"/>
-              </w:rPr>
-              <w:t>2024</w:t>
-            </w:r>
-          </w:p>
-        </w:tc>
-        <w:tc>
-          <w:tcPr>
-            <w:tcW w:w="1605" w:type="dxa"/>
-            <w:tcBorders>
-              <w:top w:val="single" w:color="auto" w:sz="4" w:space="0"/>
-              <w:left w:val="nil"/>
-              <w:bottom w:val="single" w:color="auto" w:sz="4" w:space="0"/>
-              <w:right w:val="single" w:color="auto" w:sz="4" w:space="0"/>
-            </w:tcBorders>
-            <w:shd w:val="clear" w:color="auto" w:fill="auto"/>
-            <w:vAlign w:val="center"/>
-          </w:tcPr>
-          <w:p>
-            <w:pPr>
-              <w:jc w:val="center"/>
-              <w:rPr>
-                <w:rFonts w:cs="Arial"/>
-                <w:highlight w:val="yellow"/>
-                <w:lang w:val="en-US"/>
-              </w:rPr>
-            </w:pPr>
-            <w:r>
-              <w:rPr>
-                <w:rFonts w:cs="Arial"/>
-                <w:highlight w:val="yellow"/>
-                <w:lang w:val="en-US"/>
-              </w:rPr>
-              <w:t>1455</w:t>
-            </w:r>
-          </w:p>
-        </w:tc>
-        <w:tc>
-          <w:tcPr>
-            <w:tcW w:w="1843" w:type="dxa"/>
-            <w:tcBorders>
-              <w:top w:val="single" w:color="auto" w:sz="4" w:space="0"/>
-              <w:left w:val="nil"/>
-              <w:bottom w:val="single" w:color="auto" w:sz="4" w:space="0"/>
-              <w:right w:val="single" w:color="auto" w:sz="4" w:space="0"/>
-            </w:tcBorders>
-            <w:vAlign w:val="center"/>
-          </w:tcPr>
-          <w:p>
-            <w:pPr>
-              <w:jc w:val="center"/>
-              <w:rPr>
-                <w:rFonts w:cs="Arial"/>
-                <w:highlight w:val="yellow"/>
-                <w:lang w:val="en-US"/>
-              </w:rPr>
-            </w:pPr>
-            <w:r>
-              <w:rPr>
-                <w:rFonts w:cs="Arial"/>
-                <w:highlight w:val="yellow"/>
-                <w:lang w:val="en-US"/>
-              </w:rPr>
-              <w:t>1455</w:t>
-            </w:r>
-          </w:p>
-        </w:tc>
-      </w:tr>
-      <w:bookmarkEnd w:id="2"/>
+      <w:bookmarkEnd w:id="3"/>
     </w:tbl>
     <w:p>
       <w:pPr>
@@ -2886,12 +2330,12 @@
         <w:tblW w:w="5157" w:type="pct"/>
         <w:tblInd w:w="-289" w:type="dxa"/>
         <w:tblBorders>
-          <w:top w:val="single" w:color="FFFFFF" w:sz="4" w:space="0"/>
-          <w:left w:val="single" w:color="FFFFFF" w:sz="4" w:space="0"/>
-          <w:bottom w:val="single" w:color="FFFFFF" w:sz="4" w:space="0"/>
-          <w:right w:val="single" w:color="FFFFFF" w:sz="4" w:space="0"/>
-          <w:insideH w:val="single" w:color="FFFFFF" w:sz="4" w:space="0"/>
-          <w:insideV w:val="single" w:color="FFFFFF" w:sz="4" w:space="0"/>
+          <w:top w:val="single" w:sz="4" w:space="0" w:color="FFFFFF"/>
+          <w:left w:val="single" w:sz="4" w:space="0" w:color="FFFFFF"/>
+          <w:bottom w:val="single" w:sz="4" w:space="0" w:color="FFFFFF"/>
+          <w:right w:val="single" w:sz="4" w:space="0" w:color="FFFFFF"/>
+          <w:insideH w:val="single" w:sz="4" w:space="0" w:color="FFFFFF"/>
+          <w:insideV w:val="single" w:sz="4" w:space="0" w:color="FFFFFF"/>
         </w:tblBorders>
         <w:shd w:val="clear" w:color="auto" w:fill="FFFFFF"/>
         <w:tblLook w:val="04A0" w:firstRow="1" w:lastRow="0" w:firstColumn="1" w:lastColumn="0" w:noHBand="0" w:noVBand="1"/>
@@ -3051,7 +2495,7 @@
               </w:rPr>
             </w:pPr>
             <w:r>
-              <w:t>Max Darmawan</w:t>
+              <w:t>Eddy Wahyudi</w:t>
             </w:r>
           </w:p>
           <w:p>
@@ -3101,7 +2545,7 @@
           </w:p>
         </w:tc>
       </w:tr>
-      <w:bookmarkEnd w:id="3"/>
+      <w:bookmarkEnd w:id="2"/>
     </w:tbl>
     <w:p>
       <w:pPr>
@@ -3116,9 +2560,9 @@
       </w:pPr>
     </w:p>
     <w:sectPr>
-      <w:headerReference w:type="default" r:id="rId18"/>
-      <w:headerReference w:type="first" r:id="rId19"/>
-      <w:pgSz w:w="11906" w:h="16838" w:orient="portrait"/>
+      <w:headerReference w:type="default" r:id="rId15"/>
+      <w:headerReference w:type="first" r:id="rId16"/>
+      <w:pgSz w:w="11906" w:h="16838"/>
       <w:pgMar w:top="1134" w:right="1134" w:bottom="1134" w:left="1418" w:header="720" w:footer="720" w:gutter="0"/>
       <w:cols w:space="0"/>
       <w:titlePg/>
@@ -3129,7 +2573,7 @@
 </file>
 
 <file path=word/endnotes.xml><?xml version="1.0" encoding="utf-8"?>
-<w:endnotes xmlns:wpc="http://schemas.microsoft.com/office/word/2010/wordprocessingCanvas" xmlns:cx="http://schemas.microsoft.com/office/drawing/2014/chartex" xmlns:cx1="http://schemas.microsoft.com/office/drawing/2015/9/8/chartex" xmlns:cx2="http://schemas.microsoft.com/office/drawing/2015/10/21/chartex" xmlns:cx3="http://schemas.microsoft.com/office/drawing/2016/5/9/chartex" xmlns:cx4="http://schemas.microsoft.com/office/drawing/2016/5/10/chartex" xmlns:cx5="http://schemas.microsoft.com/office/drawing/2016/5/11/chartex" xmlns:cx6="http://schemas.microsoft.com/office/drawing/2016/5/12/chartex" xmlns:cx7="http://schemas.microsoft.com/office/drawing/2016/5/13/chartex" xmlns:cx8="http://schemas.microsoft.com/office/drawing/2016/5/14/chartex" xmlns:mc="http://schemas.openxmlformats.org/markup-compatibility/2006" xmlns:aink="http://schemas.microsoft.com/office/drawing/2016/ink" xmlns:am3d="http://schemas.microsoft.com/office/drawing/2017/model3d" xmlns:o="urn:schemas-microsoft-com:office:office" xmlns:r="http://schemas.openxmlformats.org/officeDocument/2006/relationships" xmlns:m="http://schemas.openxmlformats.org/officeDocument/2006/math" xmlns:v="urn:schemas-microsoft-com:vml" xmlns:wp14="http://schemas.microsoft.com/office/word/2010/wordprocessingDrawing" xmlns:wp="http://schemas.openxmlformats.org/drawingml/2006/wordprocessingDrawing" xmlns:w10="urn:schemas-microsoft-com:office:word" xmlns:w="http://schemas.openxmlformats.org/wordprocessingml/2006/main" xmlns:w14="http://schemas.microsoft.com/office/word/2010/wordml" xmlns:w15="http://schemas.microsoft.com/office/word/2012/wordml" xmlns:w16cex="http://schemas.microsoft.com/office/word/2018/wordml/cex" xmlns:w16cid="http://schemas.microsoft.com/office/word/2016/wordml/cid" xmlns:w16="http://schemas.microsoft.com/office/word/2018/wordml" xmlns:w16sdtdh="http://schemas.microsoft.com/office/word/2020/wordml/sdtdatahash" xmlns:w16se="http://schemas.microsoft.com/office/word/2015/wordml/symex" xmlns:wpg="http://schemas.microsoft.com/office/word/2010/wordprocessingGroup" xmlns:wpi="http://schemas.microsoft.com/office/word/2010/wordprocessingInk" xmlns:wne="http://schemas.microsoft.com/office/word/2006/wordml" xmlns:wps="http://schemas.microsoft.com/office/word/2010/wordprocessingShape" mc:Ignorable="w14 w15 w16se w16cid w16 w16cex w16sdtdh wp14">
+<w:endnotes xmlns:wpc="http://schemas.microsoft.com/office/word/2010/wordprocessingCanvas" xmlns:cx="http://schemas.microsoft.com/office/drawing/2014/chartex" xmlns:cx1="http://schemas.microsoft.com/office/drawing/2015/9/8/chartex" xmlns:cx2="http://schemas.microsoft.com/office/drawing/2015/10/21/chartex" xmlns:cx3="http://schemas.microsoft.com/office/drawing/2016/5/9/chartex" xmlns:cx4="http://schemas.microsoft.com/office/drawing/2016/5/10/chartex" xmlns:cx5="http://schemas.microsoft.com/office/drawing/2016/5/11/chartex" xmlns:cx6="http://schemas.microsoft.com/office/drawing/2016/5/12/chartex" xmlns:cx7="http://schemas.microsoft.com/office/drawing/2016/5/13/chartex" xmlns:cx8="http://schemas.microsoft.com/office/drawing/2016/5/14/chartex" xmlns:mc="http://schemas.openxmlformats.org/markup-compatibility/2006" xmlns:aink="http://schemas.microsoft.com/office/drawing/2016/ink" xmlns:am3d="http://schemas.microsoft.com/office/drawing/2017/model3d" xmlns:o="urn:schemas-microsoft-com:office:office" xmlns:oel="http://schemas.microsoft.com/office/2019/extlst" xmlns:r="http://schemas.openxmlformats.org/officeDocument/2006/relationships" xmlns:m="http://schemas.openxmlformats.org/officeDocument/2006/math" xmlns:v="urn:schemas-microsoft-com:vml" xmlns:wp14="http://schemas.microsoft.com/office/word/2010/wordprocessingDrawing" xmlns:wp="http://schemas.openxmlformats.org/drawingml/2006/wordprocessingDrawing" xmlns:w10="urn:schemas-microsoft-com:office:word" xmlns:w="http://schemas.openxmlformats.org/wordprocessingml/2006/main" xmlns:w14="http://schemas.microsoft.com/office/word/2010/wordml" xmlns:w15="http://schemas.microsoft.com/office/word/2012/wordml" xmlns:w16cex="http://schemas.microsoft.com/office/word/2018/wordml/cex" xmlns:w16cid="http://schemas.microsoft.com/office/word/2016/wordml/cid" xmlns:w16="http://schemas.microsoft.com/office/word/2018/wordml" xmlns:w16du="http://schemas.microsoft.com/office/word/2023/wordml/word16du" xmlns:w16sdtdh="http://schemas.microsoft.com/office/word/2020/wordml/sdtdatahash" xmlns:w16sdtfl="http://schemas.microsoft.com/office/word/2024/wordml/sdtformatlock" xmlns:w16se="http://schemas.microsoft.com/office/word/2015/wordml/symex" xmlns:wpg="http://schemas.microsoft.com/office/word/2010/wordprocessingGroup" xmlns:wpi="http://schemas.microsoft.com/office/word/2010/wordprocessingInk" xmlns:wne="http://schemas.microsoft.com/office/word/2006/wordml" xmlns:wps="http://schemas.microsoft.com/office/word/2010/wordprocessingShape" mc:Ignorable="w14 w15 w16se w16cid w16 w16cex w16sdtdh w16sdtfl w16du wp14">
   <w:endnote w:type="separator" w:id="-1">
     <w:p>
       <w:r>
@@ -3151,7 +2595,7 @@
 </file>
 
 <file path=word/footnotes.xml><?xml version="1.0" encoding="utf-8"?>
-<w:footnotes xmlns:wpc="http://schemas.microsoft.com/office/word/2010/wordprocessingCanvas" xmlns:cx="http://schemas.microsoft.com/office/drawing/2014/chartex" xmlns:cx1="http://schemas.microsoft.com/office/drawing/2015/9/8/chartex" xmlns:cx2="http://schemas.microsoft.com/office/drawing/2015/10/21/chartex" xmlns:cx3="http://schemas.microsoft.com/office/drawing/2016/5/9/chartex" xmlns:cx4="http://schemas.microsoft.com/office/drawing/2016/5/10/chartex" xmlns:cx5="http://schemas.microsoft.com/office/drawing/2016/5/11/chartex" xmlns:cx6="http://schemas.microsoft.com/office/drawing/2016/5/12/chartex" xmlns:cx7="http://schemas.microsoft.com/office/drawing/2016/5/13/chartex" xmlns:cx8="http://schemas.microsoft.com/office/drawing/2016/5/14/chartex" xmlns:mc="http://schemas.openxmlformats.org/markup-compatibility/2006" xmlns:aink="http://schemas.microsoft.com/office/drawing/2016/ink" xmlns:am3d="http://schemas.microsoft.com/office/drawing/2017/model3d" xmlns:o="urn:schemas-microsoft-com:office:office" xmlns:r="http://schemas.openxmlformats.org/officeDocument/2006/relationships" xmlns:m="http://schemas.openxmlformats.org/officeDocument/2006/math" xmlns:v="urn:schemas-microsoft-com:vml" xmlns:wp14="http://schemas.microsoft.com/office/word/2010/wordprocessingDrawing" xmlns:wp="http://schemas.openxmlformats.org/drawingml/2006/wordprocessingDrawing" xmlns:w10="urn:schemas-microsoft-com:office:word" xmlns:w="http://schemas.openxmlformats.org/wordprocessingml/2006/main" xmlns:w14="http://schemas.microsoft.com/office/word/2010/wordml" xmlns:w15="http://schemas.microsoft.com/office/word/2012/wordml" xmlns:w16cex="http://schemas.microsoft.com/office/word/2018/wordml/cex" xmlns:w16cid="http://schemas.microsoft.com/office/word/2016/wordml/cid" xmlns:w16="http://schemas.microsoft.com/office/word/2018/wordml" xmlns:w16sdtdh="http://schemas.microsoft.com/office/word/2020/wordml/sdtdatahash" xmlns:w16se="http://schemas.microsoft.com/office/word/2015/wordml/symex" xmlns:wpg="http://schemas.microsoft.com/office/word/2010/wordprocessingGroup" xmlns:wpi="http://schemas.microsoft.com/office/word/2010/wordprocessingInk" xmlns:wne="http://schemas.microsoft.com/office/word/2006/wordml" xmlns:wps="http://schemas.microsoft.com/office/word/2010/wordprocessingShape" mc:Ignorable="w14 w15 w16se w16cid w16 w16cex w16sdtdh wp14">
+<w:footnotes xmlns:wpc="http://schemas.microsoft.com/office/word/2010/wordprocessingCanvas" xmlns:cx="http://schemas.microsoft.com/office/drawing/2014/chartex" xmlns:cx1="http://schemas.microsoft.com/office/drawing/2015/9/8/chartex" xmlns:cx2="http://schemas.microsoft.com/office/drawing/2015/10/21/chartex" xmlns:cx3="http://schemas.microsoft.com/office/drawing/2016/5/9/chartex" xmlns:cx4="http://schemas.microsoft.com/office/drawing/2016/5/10/chartex" xmlns:cx5="http://schemas.microsoft.com/office/drawing/2016/5/11/chartex" xmlns:cx6="http://schemas.microsoft.com/office/drawing/2016/5/12/chartex" xmlns:cx7="http://schemas.microsoft.com/office/drawing/2016/5/13/chartex" xmlns:cx8="http://schemas.microsoft.com/office/drawing/2016/5/14/chartex" xmlns:mc="http://schemas.openxmlformats.org/markup-compatibility/2006" xmlns:aink="http://schemas.microsoft.com/office/drawing/2016/ink" xmlns:am3d="http://schemas.microsoft.com/office/drawing/2017/model3d" xmlns:o="urn:schemas-microsoft-com:office:office" xmlns:oel="http://schemas.microsoft.com/office/2019/extlst" xmlns:r="http://schemas.openxmlformats.org/officeDocument/2006/relationships" xmlns:m="http://schemas.openxmlformats.org/officeDocument/2006/math" xmlns:v="urn:schemas-microsoft-com:vml" xmlns:wp14="http://schemas.microsoft.com/office/word/2010/wordprocessingDrawing" xmlns:wp="http://schemas.openxmlformats.org/drawingml/2006/wordprocessingDrawing" xmlns:w10="urn:schemas-microsoft-com:office:word" xmlns:w="http://schemas.openxmlformats.org/wordprocessingml/2006/main" xmlns:w14="http://schemas.microsoft.com/office/word/2010/wordml" xmlns:w15="http://schemas.microsoft.com/office/word/2012/wordml" xmlns:w16cex="http://schemas.microsoft.com/office/word/2018/wordml/cex" xmlns:w16cid="http://schemas.microsoft.com/office/word/2016/wordml/cid" xmlns:w16="http://schemas.microsoft.com/office/word/2018/wordml" xmlns:w16du="http://schemas.microsoft.com/office/word/2023/wordml/word16du" xmlns:w16sdtdh="http://schemas.microsoft.com/office/word/2020/wordml/sdtdatahash" xmlns:w16sdtfl="http://schemas.microsoft.com/office/word/2024/wordml/sdtformatlock" xmlns:w16se="http://schemas.microsoft.com/office/word/2015/wordml/symex" xmlns:wpg="http://schemas.microsoft.com/office/word/2010/wordprocessingGroup" xmlns:wpi="http://schemas.microsoft.com/office/word/2010/wordprocessingInk" xmlns:wne="http://schemas.microsoft.com/office/word/2006/wordml" xmlns:wps="http://schemas.microsoft.com/office/word/2010/wordprocessingShape" mc:Ignorable="w14 w15 w16se w16cid w16 w16cex w16sdtdh w16sdtfl w16du wp14">
   <w:footnote w:type="separator" w:id="-1">
     <w:p>
       <w:r>
@@ -3173,7 +2617,7 @@
 </file>
 
 <file path=word/header1.xml><?xml version="1.0" encoding="utf-8"?>
-<w:hdr xmlns:wpc="http://schemas.microsoft.com/office/word/2010/wordprocessingCanvas" xmlns:cx="http://schemas.microsoft.com/office/drawing/2014/chartex" xmlns:cx1="http://schemas.microsoft.com/office/drawing/2015/9/8/chartex" xmlns:cx2="http://schemas.microsoft.com/office/drawing/2015/10/21/chartex" xmlns:cx3="http://schemas.microsoft.com/office/drawing/2016/5/9/chartex" xmlns:cx4="http://schemas.microsoft.com/office/drawing/2016/5/10/chartex" xmlns:cx5="http://schemas.microsoft.com/office/drawing/2016/5/11/chartex" xmlns:cx6="http://schemas.microsoft.com/office/drawing/2016/5/12/chartex" xmlns:cx7="http://schemas.microsoft.com/office/drawing/2016/5/13/chartex" xmlns:cx8="http://schemas.microsoft.com/office/drawing/2016/5/14/chartex" xmlns:mc="http://schemas.openxmlformats.org/markup-compatibility/2006" xmlns:aink="http://schemas.microsoft.com/office/drawing/2016/ink" xmlns:am3d="http://schemas.microsoft.com/office/drawing/2017/model3d" xmlns:o="urn:schemas-microsoft-com:office:office" xmlns:r="http://schemas.openxmlformats.org/officeDocument/2006/relationships" xmlns:m="http://schemas.openxmlformats.org/officeDocument/2006/math" xmlns:v="urn:schemas-microsoft-com:vml" xmlns:wp14="http://schemas.microsoft.com/office/word/2010/wordprocessingDrawing" xmlns:wp="http://schemas.openxmlformats.org/drawingml/2006/wordprocessingDrawing" xmlns:w10="urn:schemas-microsoft-com:office:word" xmlns:w="http://schemas.openxmlformats.org/wordprocessingml/2006/main" xmlns:w14="http://schemas.microsoft.com/office/word/2010/wordml" xmlns:w15="http://schemas.microsoft.com/office/word/2012/wordml" xmlns:w16cex="http://schemas.microsoft.com/office/word/2018/wordml/cex" xmlns:w16cid="http://schemas.microsoft.com/office/word/2016/wordml/cid" xmlns:w16="http://schemas.microsoft.com/office/word/2018/wordml" xmlns:w16sdtdh="http://schemas.microsoft.com/office/word/2020/wordml/sdtdatahash" xmlns:w16se="http://schemas.microsoft.com/office/word/2015/wordml/symex" xmlns:wpg="http://schemas.microsoft.com/office/word/2010/wordprocessingGroup" xmlns:wpi="http://schemas.microsoft.com/office/word/2010/wordprocessingInk" xmlns:wne="http://schemas.microsoft.com/office/word/2006/wordml" xmlns:wps="http://schemas.microsoft.com/office/word/2010/wordprocessingShape" mc:Ignorable="w14 w15 w16se w16cid w16 w16cex w16sdtdh wp14">
+<w:hdr xmlns:wpc="http://schemas.microsoft.com/office/word/2010/wordprocessingCanvas" xmlns:cx="http://schemas.microsoft.com/office/drawing/2014/chartex" xmlns:cx1="http://schemas.microsoft.com/office/drawing/2015/9/8/chartex" xmlns:cx2="http://schemas.microsoft.com/office/drawing/2015/10/21/chartex" xmlns:cx3="http://schemas.microsoft.com/office/drawing/2016/5/9/chartex" xmlns:cx4="http://schemas.microsoft.com/office/drawing/2016/5/10/chartex" xmlns:cx5="http://schemas.microsoft.com/office/drawing/2016/5/11/chartex" xmlns:cx6="http://schemas.microsoft.com/office/drawing/2016/5/12/chartex" xmlns:cx7="http://schemas.microsoft.com/office/drawing/2016/5/13/chartex" xmlns:cx8="http://schemas.microsoft.com/office/drawing/2016/5/14/chartex" xmlns:mc="http://schemas.openxmlformats.org/markup-compatibility/2006" xmlns:aink="http://schemas.microsoft.com/office/drawing/2016/ink" xmlns:am3d="http://schemas.microsoft.com/office/drawing/2017/model3d" xmlns:o="urn:schemas-microsoft-com:office:office" xmlns:oel="http://schemas.microsoft.com/office/2019/extlst" xmlns:r="http://schemas.openxmlformats.org/officeDocument/2006/relationships" xmlns:m="http://schemas.openxmlformats.org/officeDocument/2006/math" xmlns:v="urn:schemas-microsoft-com:vml" xmlns:wp14="http://schemas.microsoft.com/office/word/2010/wordprocessingDrawing" xmlns:wp="http://schemas.openxmlformats.org/drawingml/2006/wordprocessingDrawing" xmlns:w10="urn:schemas-microsoft-com:office:word" xmlns:w="http://schemas.openxmlformats.org/wordprocessingml/2006/main" xmlns:w14="http://schemas.microsoft.com/office/word/2010/wordml" xmlns:w15="http://schemas.microsoft.com/office/word/2012/wordml" xmlns:w16cex="http://schemas.microsoft.com/office/word/2018/wordml/cex" xmlns:w16cid="http://schemas.microsoft.com/office/word/2016/wordml/cid" xmlns:w16="http://schemas.microsoft.com/office/word/2018/wordml" xmlns:w16du="http://schemas.microsoft.com/office/word/2023/wordml/word16du" xmlns:w16sdtdh="http://schemas.microsoft.com/office/word/2020/wordml/sdtdatahash" xmlns:w16sdtfl="http://schemas.microsoft.com/office/word/2024/wordml/sdtformatlock" xmlns:w16se="http://schemas.microsoft.com/office/word/2015/wordml/symex" xmlns:wpg="http://schemas.microsoft.com/office/word/2010/wordprocessingGroup" xmlns:wpi="http://schemas.microsoft.com/office/word/2010/wordprocessingInk" xmlns:wne="http://schemas.microsoft.com/office/word/2006/wordml" xmlns:wps="http://schemas.microsoft.com/office/word/2010/wordprocessingShape" mc:Ignorable="w14 w15 w16se w16cid w16 w16cex w16sdtdh w16sdtfl w16du wp14">
   <w:p>
     <w:pPr>
       <w:jc w:val="center"/>
@@ -3214,13 +2658,13 @@
 </file>
 
 <file path=word/header2.xml><?xml version="1.0" encoding="utf-8"?>
-<w:hdr xmlns:wpc="http://schemas.microsoft.com/office/word/2010/wordprocessingCanvas" xmlns:cx="http://schemas.microsoft.com/office/drawing/2014/chartex" xmlns:cx1="http://schemas.microsoft.com/office/drawing/2015/9/8/chartex" xmlns:cx2="http://schemas.microsoft.com/office/drawing/2015/10/21/chartex" xmlns:cx3="http://schemas.microsoft.com/office/drawing/2016/5/9/chartex" xmlns:cx4="http://schemas.microsoft.com/office/drawing/2016/5/10/chartex" xmlns:cx5="http://schemas.microsoft.com/office/drawing/2016/5/11/chartex" xmlns:cx6="http://schemas.microsoft.com/office/drawing/2016/5/12/chartex" xmlns:cx7="http://schemas.microsoft.com/office/drawing/2016/5/13/chartex" xmlns:cx8="http://schemas.microsoft.com/office/drawing/2016/5/14/chartex" xmlns:mc="http://schemas.openxmlformats.org/markup-compatibility/2006" xmlns:aink="http://schemas.microsoft.com/office/drawing/2016/ink" xmlns:am3d="http://schemas.microsoft.com/office/drawing/2017/model3d" xmlns:o="urn:schemas-microsoft-com:office:office" xmlns:r="http://schemas.openxmlformats.org/officeDocument/2006/relationships" xmlns:m="http://schemas.openxmlformats.org/officeDocument/2006/math" xmlns:v="urn:schemas-microsoft-com:vml" xmlns:wp14="http://schemas.microsoft.com/office/word/2010/wordprocessingDrawing" xmlns:wp="http://schemas.openxmlformats.org/drawingml/2006/wordprocessingDrawing" xmlns:w10="urn:schemas-microsoft-com:office:word" xmlns:w="http://schemas.openxmlformats.org/wordprocessingml/2006/main" xmlns:w14="http://schemas.microsoft.com/office/word/2010/wordml" xmlns:w15="http://schemas.microsoft.com/office/word/2012/wordml" xmlns:w16cex="http://schemas.microsoft.com/office/word/2018/wordml/cex" xmlns:w16cid="http://schemas.microsoft.com/office/word/2016/wordml/cid" xmlns:w16="http://schemas.microsoft.com/office/word/2018/wordml" xmlns:w16sdtdh="http://schemas.microsoft.com/office/word/2020/wordml/sdtdatahash" xmlns:w16se="http://schemas.microsoft.com/office/word/2015/wordml/symex" xmlns:wpg="http://schemas.microsoft.com/office/word/2010/wordprocessingGroup" xmlns:wpi="http://schemas.microsoft.com/office/word/2010/wordprocessingInk" xmlns:wne="http://schemas.microsoft.com/office/word/2006/wordml" xmlns:wps="http://schemas.microsoft.com/office/word/2010/wordprocessingShape" xmlns:a="http://schemas.openxmlformats.org/drawingml/2006/main" xmlns:pic="http://schemas.openxmlformats.org/drawingml/2006/picture" mc:Ignorable="w14 w15 w16se w16cid w16 w16cex w16sdtdh wp14">
+<w:hdr xmlns:wpc="http://schemas.microsoft.com/office/word/2010/wordprocessingCanvas" xmlns:cx="http://schemas.microsoft.com/office/drawing/2014/chartex" xmlns:cx1="http://schemas.microsoft.com/office/drawing/2015/9/8/chartex" xmlns:cx2="http://schemas.microsoft.com/office/drawing/2015/10/21/chartex" xmlns:cx3="http://schemas.microsoft.com/office/drawing/2016/5/9/chartex" xmlns:cx4="http://schemas.microsoft.com/office/drawing/2016/5/10/chartex" xmlns:cx5="http://schemas.microsoft.com/office/drawing/2016/5/11/chartex" xmlns:cx6="http://schemas.microsoft.com/office/drawing/2016/5/12/chartex" xmlns:cx7="http://schemas.microsoft.com/office/drawing/2016/5/13/chartex" xmlns:cx8="http://schemas.microsoft.com/office/drawing/2016/5/14/chartex" xmlns:mc="http://schemas.openxmlformats.org/markup-compatibility/2006" xmlns:aink="http://schemas.microsoft.com/office/drawing/2016/ink" xmlns:am3d="http://schemas.microsoft.com/office/drawing/2017/model3d" xmlns:o="urn:schemas-microsoft-com:office:office" xmlns:oel="http://schemas.microsoft.com/office/2019/extlst" xmlns:r="http://schemas.openxmlformats.org/officeDocument/2006/relationships" xmlns:m="http://schemas.openxmlformats.org/officeDocument/2006/math" xmlns:v="urn:schemas-microsoft-com:vml" xmlns:wp14="http://schemas.microsoft.com/office/word/2010/wordprocessingDrawing" xmlns:wp="http://schemas.openxmlformats.org/drawingml/2006/wordprocessingDrawing" xmlns:w10="urn:schemas-microsoft-com:office:word" xmlns:w="http://schemas.openxmlformats.org/wordprocessingml/2006/main" xmlns:w14="http://schemas.microsoft.com/office/word/2010/wordml" xmlns:w15="http://schemas.microsoft.com/office/word/2012/wordml" xmlns:w16cex="http://schemas.microsoft.com/office/word/2018/wordml/cex" xmlns:w16cid="http://schemas.microsoft.com/office/word/2016/wordml/cid" xmlns:w16="http://schemas.microsoft.com/office/word/2018/wordml" xmlns:w16du="http://schemas.microsoft.com/office/word/2023/wordml/word16du" xmlns:w16sdtdh="http://schemas.microsoft.com/office/word/2020/wordml/sdtdatahash" xmlns:w16sdtfl="http://schemas.microsoft.com/office/word/2024/wordml/sdtformatlock" xmlns:w16se="http://schemas.microsoft.com/office/word/2015/wordml/symex" xmlns:wpg="http://schemas.microsoft.com/office/word/2010/wordprocessingGroup" xmlns:wpi="http://schemas.microsoft.com/office/word/2010/wordprocessingInk" xmlns:wne="http://schemas.microsoft.com/office/word/2006/wordml" xmlns:wps="http://schemas.microsoft.com/office/word/2010/wordprocessingShape" mc:Ignorable="w14 w15 w16se w16cid w16 w16cex w16sdtdh w16sdtfl w16du wp14">
   <w:tbl>
     <w:tblPr>
       <w:tblW w:w="9640" w:type="dxa"/>
       <w:tblInd w:w="-284" w:type="dxa"/>
       <w:tblBorders>
-        <w:bottom w:val="single" w:color="000000" w:sz="12" w:space="0"/>
+        <w:bottom w:val="single" w:sz="12" w:space="0" w:color="000000"/>
       </w:tblBorders>
       <w:shd w:val="clear" w:color="auto" w:fill="FFFFFF"/>
       <w:tblLayout w:type="fixed"/>
@@ -3247,7 +2691,7 @@
               <w:rFonts w:eastAsia="Arial" w:cs="Arial"/>
             </w:rPr>
           </w:pPr>
-          <w:bookmarkStart w:name="_Hlk129081240" w:id="4"/>
+          <w:bookmarkStart w:id="4" w:name="_Hlk129081240"/>
           <w:r>
             <w:rPr>
               <w:noProof/>
@@ -3399,7 +2843,7 @@
             <w:pStyle w:val="Alamat"/>
             <w:ind w:left="-126" w:right="-101"/>
           </w:pPr>
-          <w:hyperlink w:history="1" r:id="rId2">
+          <w:hyperlink r:id="rId2" w:history="1">
             <w:r>
               <w:rPr>
                 <w:rStyle w:val="Hyperlink"/>
@@ -3421,7 +2865,7 @@
           <w:tcW w:w="9640" w:type="dxa"/>
           <w:gridSpan w:val="2"/>
           <w:tcBorders>
-            <w:bottom w:val="single" w:color="000000" w:sz="12" w:space="0"/>
+            <w:bottom w:val="single" w:sz="12" w:space="0" w:color="000000"/>
           </w:tcBorders>
           <w:shd w:val="clear" w:color="auto" w:fill="FFFFFF"/>
         </w:tcPr>
@@ -3443,11 +2887,11 @@
 </file>
 
 <file path=word/styles.xml><?xml version="1.0" encoding="utf-8"?>
-<w:styles xmlns:wp14="http://schemas.microsoft.com/office/word/2010/wordprocessingDrawing" xmlns:mc="http://schemas.openxmlformats.org/markup-compatibility/2006" xmlns:r="http://schemas.openxmlformats.org/officeDocument/2006/relationships" xmlns:w="http://schemas.openxmlformats.org/wordprocessingml/2006/main" xmlns:w14="http://schemas.microsoft.com/office/word/2010/wordml" xmlns:w15="http://schemas.microsoft.com/office/word/2012/wordml" xmlns:w16cex="http://schemas.microsoft.com/office/word/2018/wordml/cex" xmlns:w16cid="http://schemas.microsoft.com/office/word/2016/wordml/cid" xmlns:w16="http://schemas.microsoft.com/office/word/2018/wordml" xmlns:w16sdtdh="http://schemas.microsoft.com/office/word/2020/wordml/sdtdatahash" xmlns:w16se="http://schemas.microsoft.com/office/word/2015/wordml/symex" mc:Ignorable="w14 w15 w16se w16cid w16 w16cex w16sdtdh wp14">
+<w:styles xmlns:mc="http://schemas.openxmlformats.org/markup-compatibility/2006" xmlns:r="http://schemas.openxmlformats.org/officeDocument/2006/relationships" xmlns:w="http://schemas.openxmlformats.org/wordprocessingml/2006/main" xmlns:w14="http://schemas.microsoft.com/office/word/2010/wordml" xmlns:w15="http://schemas.microsoft.com/office/word/2012/wordml" xmlns:w16cex="http://schemas.microsoft.com/office/word/2018/wordml/cex" xmlns:w16cid="http://schemas.microsoft.com/office/word/2016/wordml/cid" xmlns:w16="http://schemas.microsoft.com/office/word/2018/wordml" xmlns:w16du="http://schemas.microsoft.com/office/word/2023/wordml/word16du" xmlns:w16sdtdh="http://schemas.microsoft.com/office/word/2020/wordml/sdtdatahash" xmlns:w16sdtfl="http://schemas.microsoft.com/office/word/2024/wordml/sdtformatlock" xmlns:w16se="http://schemas.microsoft.com/office/word/2015/wordml/symex" mc:Ignorable="w14 w15 w16se w16cid w16 w16cex w16sdtdh w16sdtfl w16du">
   <w:docDefaults>
     <w:rPrDefault>
       <w:rPr>
-        <w:rFonts w:ascii="Calibri" w:hAnsi="Calibri" w:eastAsia="Calibri" w:cs="Calibri"/>
+        <w:rFonts w:ascii="Calibri" w:eastAsia="Calibri" w:hAnsi="Calibri" w:cs="Calibri"/>
         <w:color w:val="000000"/>
         <w:sz w:val="22"/>
         <w:szCs w:val="22"/>
@@ -3459,14 +2903,14 @@
   <w:latentStyles w:defLockedState="0" w:defUIPriority="99" w:defSemiHidden="0" w:defUnhideWhenUsed="0" w:defQFormat="0" w:count="376">
     <w:lsdException w:name="Normal" w:uiPriority="0" w:qFormat="1"/>
     <w:lsdException w:name="heading 1" w:uiPriority="9" w:qFormat="1"/>
-    <w:lsdException w:name="heading 2" w:uiPriority="9" w:semiHidden="1" w:unhideWhenUsed="1" w:qFormat="1"/>
-    <w:lsdException w:name="heading 3" w:uiPriority="9" w:semiHidden="1" w:unhideWhenUsed="1" w:qFormat="1"/>
-    <w:lsdException w:name="heading 4" w:uiPriority="9" w:semiHidden="1" w:unhideWhenUsed="1" w:qFormat="1"/>
-    <w:lsdException w:name="heading 5" w:uiPriority="9" w:semiHidden="1" w:unhideWhenUsed="1" w:qFormat="1"/>
-    <w:lsdException w:name="heading 6" w:uiPriority="9" w:semiHidden="1" w:unhideWhenUsed="1" w:qFormat="1"/>
-    <w:lsdException w:name="heading 7" w:uiPriority="9" w:semiHidden="1" w:unhideWhenUsed="1" w:qFormat="1"/>
-    <w:lsdException w:name="heading 8" w:uiPriority="9" w:semiHidden="1" w:unhideWhenUsed="1" w:qFormat="1"/>
-    <w:lsdException w:name="heading 9" w:uiPriority="9" w:semiHidden="1" w:unhideWhenUsed="1" w:qFormat="1"/>
+    <w:lsdException w:name="heading 2" w:semiHidden="1" w:uiPriority="9" w:unhideWhenUsed="1" w:qFormat="1"/>
+    <w:lsdException w:name="heading 3" w:semiHidden="1" w:uiPriority="9" w:unhideWhenUsed="1" w:qFormat="1"/>
+    <w:lsdException w:name="heading 4" w:semiHidden="1" w:uiPriority="9" w:unhideWhenUsed="1" w:qFormat="1"/>
+    <w:lsdException w:name="heading 5" w:semiHidden="1" w:uiPriority="9" w:unhideWhenUsed="1" w:qFormat="1"/>
+    <w:lsdException w:name="heading 6" w:semiHidden="1" w:uiPriority="9" w:unhideWhenUsed="1" w:qFormat="1"/>
+    <w:lsdException w:name="heading 7" w:semiHidden="1" w:uiPriority="9" w:unhideWhenUsed="1" w:qFormat="1"/>
+    <w:lsdException w:name="heading 8" w:semiHidden="1" w:uiPriority="9" w:unhideWhenUsed="1" w:qFormat="1"/>
+    <w:lsdException w:name="heading 9" w:semiHidden="1" w:uiPriority="9" w:unhideWhenUsed="1" w:qFormat="1"/>
     <w:lsdException w:name="index 1" w:semiHidden="1" w:unhideWhenUsed="1"/>
     <w:lsdException w:name="index 2" w:semiHidden="1" w:unhideWhenUsed="1"/>
     <w:lsdException w:name="index 3" w:semiHidden="1" w:unhideWhenUsed="1"/>
@@ -3476,22 +2920,22 @@
     <w:lsdException w:name="index 7" w:semiHidden="1" w:unhideWhenUsed="1"/>
     <w:lsdException w:name="index 8" w:semiHidden="1" w:unhideWhenUsed="1"/>
     <w:lsdException w:name="index 9" w:semiHidden="1" w:unhideWhenUsed="1"/>
-    <w:lsdException w:name="toc 1" w:uiPriority="39" w:semiHidden="1" w:unhideWhenUsed="1"/>
-    <w:lsdException w:name="toc 2" w:uiPriority="39" w:semiHidden="1" w:unhideWhenUsed="1"/>
-    <w:lsdException w:name="toc 3" w:uiPriority="39" w:semiHidden="1" w:unhideWhenUsed="1"/>
-    <w:lsdException w:name="toc 4" w:uiPriority="39" w:semiHidden="1" w:unhideWhenUsed="1"/>
-    <w:lsdException w:name="toc 5" w:uiPriority="39" w:semiHidden="1" w:unhideWhenUsed="1"/>
-    <w:lsdException w:name="toc 6" w:uiPriority="39" w:semiHidden="1" w:unhideWhenUsed="1"/>
-    <w:lsdException w:name="toc 7" w:uiPriority="39" w:semiHidden="1" w:unhideWhenUsed="1"/>
-    <w:lsdException w:name="toc 8" w:uiPriority="39" w:semiHidden="1" w:unhideWhenUsed="1"/>
-    <w:lsdException w:name="toc 9" w:uiPriority="39" w:semiHidden="1" w:unhideWhenUsed="1"/>
+    <w:lsdException w:name="toc 1" w:semiHidden="1" w:uiPriority="39" w:unhideWhenUsed="1"/>
+    <w:lsdException w:name="toc 2" w:semiHidden="1" w:uiPriority="39" w:unhideWhenUsed="1"/>
+    <w:lsdException w:name="toc 3" w:semiHidden="1" w:uiPriority="39" w:unhideWhenUsed="1"/>
+    <w:lsdException w:name="toc 4" w:semiHidden="1" w:uiPriority="39" w:unhideWhenUsed="1"/>
+    <w:lsdException w:name="toc 5" w:semiHidden="1" w:uiPriority="39" w:unhideWhenUsed="1"/>
+    <w:lsdException w:name="toc 6" w:semiHidden="1" w:uiPriority="39" w:unhideWhenUsed="1"/>
+    <w:lsdException w:name="toc 7" w:semiHidden="1" w:uiPriority="39" w:unhideWhenUsed="1"/>
+    <w:lsdException w:name="toc 8" w:semiHidden="1" w:uiPriority="39" w:unhideWhenUsed="1"/>
+    <w:lsdException w:name="toc 9" w:semiHidden="1" w:uiPriority="39" w:unhideWhenUsed="1"/>
     <w:lsdException w:name="Normal Indent" w:semiHidden="1" w:unhideWhenUsed="1"/>
     <w:lsdException w:name="footnote text" w:semiHidden="1" w:unhideWhenUsed="1"/>
     <w:lsdException w:name="annotation text" w:semiHidden="1" w:unhideWhenUsed="1"/>
     <w:lsdException w:name="header" w:semiHidden="1" w:unhideWhenUsed="1"/>
     <w:lsdException w:name="footer" w:semiHidden="1" w:unhideWhenUsed="1"/>
     <w:lsdException w:name="index heading" w:semiHidden="1" w:unhideWhenUsed="1"/>
-    <w:lsdException w:name="caption" w:uiPriority="35" w:semiHidden="1" w:unhideWhenUsed="1" w:qFormat="1"/>
+    <w:lsdException w:name="caption" w:semiHidden="1" w:uiPriority="35" w:unhideWhenUsed="1" w:qFormat="1"/>
     <w:lsdException w:name="table of figures" w:semiHidden="1" w:unhideWhenUsed="1"/>
     <w:lsdException w:name="envelope address" w:semiHidden="1" w:unhideWhenUsed="1"/>
     <w:lsdException w:name="envelope return" w:semiHidden="1" w:unhideWhenUsed="1"/>
@@ -3522,7 +2966,7 @@
     <w:lsdException w:name="Title" w:uiPriority="10" w:qFormat="1"/>
     <w:lsdException w:name="Closing" w:semiHidden="1" w:unhideWhenUsed="1"/>
     <w:lsdException w:name="Signature" w:semiHidden="1" w:unhideWhenUsed="1"/>
-    <w:lsdException w:name="Default Paragraph Font" w:uiPriority="1" w:semiHidden="1" w:unhideWhenUsed="1"/>
+    <w:lsdException w:name="Default Paragraph Font" w:semiHidden="1" w:uiPriority="1" w:unhideWhenUsed="1"/>
     <w:lsdException w:name="Body Text" w:semiHidden="1" w:unhideWhenUsed="1"/>
     <w:lsdException w:name="Body Text Indent" w:semiHidden="1" w:unhideWhenUsed="1"/>
     <w:lsdException w:name="List Continue" w:semiHidden="1" w:unhideWhenUsed="1"/>
@@ -3722,8 +3166,8 @@
     <w:lsdException w:name="Subtle Reference" w:uiPriority="31" w:qFormat="1"/>
     <w:lsdException w:name="Intense Reference" w:uiPriority="32" w:qFormat="1"/>
     <w:lsdException w:name="Book Title" w:uiPriority="33" w:qFormat="1"/>
-    <w:lsdException w:name="Bibliography" w:uiPriority="37" w:semiHidden="1" w:unhideWhenUsed="1"/>
-    <w:lsdException w:name="TOC Heading" w:uiPriority="39" w:semiHidden="1" w:unhideWhenUsed="1" w:qFormat="1"/>
+    <w:lsdException w:name="Bibliography" w:semiHidden="1" w:uiPriority="37" w:unhideWhenUsed="1"/>
+    <w:lsdException w:name="TOC Heading" w:semiHidden="1" w:uiPriority="39" w:unhideWhenUsed="1" w:qFormat="1"/>
     <w:lsdException w:name="Plain Table 1" w:uiPriority="41"/>
     <w:lsdException w:name="Plain Table 2" w:uiPriority="42"/>
     <w:lsdException w:name="Plain Table 3" w:uiPriority="43"/>
@@ -3834,7 +3278,7 @@
     <w:lsdException w:name="Unresolved Mention" w:semiHidden="1" w:unhideWhenUsed="1"/>
     <w:lsdException w:name="Smart Link" w:semiHidden="1" w:unhideWhenUsed="1"/>
   </w:latentStyles>
-  <w:style w:type="paragraph" w:styleId="Normal" w:default="1">
+  <w:style w:type="paragraph" w:default="1" w:styleId="Normal">
     <w:name w:val="Normal"/>
     <w:qFormat/>
     <w:rPr>
@@ -3853,7 +3297,7 @@
       <w:outlineLvl w:val="0"/>
     </w:pPr>
     <w:rPr>
-      <w:rFonts w:ascii="Calibri Light" w:hAnsi="Calibri Light" w:eastAsia="Calibri Light" w:cs="Calibri Light"/>
+      <w:rFonts w:ascii="Calibri Light" w:eastAsia="Calibri Light" w:hAnsi="Calibri Light" w:cs="Calibri Light"/>
       <w:color w:val="2F5496"/>
       <w:sz w:val="32"/>
       <w:szCs w:val="32"/>
@@ -3873,7 +3317,7 @@
       <w:outlineLvl w:val="1"/>
     </w:pPr>
     <w:rPr>
-      <w:rFonts w:ascii="Calibri Light" w:hAnsi="Calibri Light" w:eastAsia="Calibri Light" w:cs="Calibri Light"/>
+      <w:rFonts w:ascii="Calibri Light" w:eastAsia="Calibri Light" w:hAnsi="Calibri Light" w:cs="Calibri Light"/>
       <w:color w:val="2F5496"/>
       <w:sz w:val="26"/>
       <w:szCs w:val="26"/>
@@ -3893,7 +3337,7 @@
       <w:outlineLvl w:val="2"/>
     </w:pPr>
     <w:rPr>
-      <w:rFonts w:ascii="Calibri Light" w:hAnsi="Calibri Light" w:eastAsia="Calibri Light" w:cs="Calibri Light"/>
+      <w:rFonts w:ascii="Calibri Light" w:eastAsia="Calibri Light" w:hAnsi="Calibri Light" w:cs="Calibri Light"/>
       <w:color w:val="1F3763"/>
       <w:sz w:val="24"/>
       <w:szCs w:val="24"/>
@@ -3913,7 +3357,7 @@
       <w:outlineLvl w:val="3"/>
     </w:pPr>
     <w:rPr>
-      <w:rFonts w:ascii="Calibri Light" w:hAnsi="Calibri Light" w:eastAsia="Calibri Light" w:cs="Calibri Light"/>
+      <w:rFonts w:ascii="Calibri Light" w:eastAsia="Calibri Light" w:hAnsi="Calibri Light" w:cs="Calibri Light"/>
       <w:i/>
       <w:iCs/>
       <w:color w:val="2F5496"/>
@@ -3933,7 +3377,7 @@
       <w:outlineLvl w:val="4"/>
     </w:pPr>
     <w:rPr>
-      <w:rFonts w:ascii="Calibri Light" w:hAnsi="Calibri Light" w:eastAsia="Calibri Light" w:cs="Calibri Light"/>
+      <w:rFonts w:ascii="Calibri Light" w:eastAsia="Calibri Light" w:hAnsi="Calibri Light" w:cs="Calibri Light"/>
       <w:color w:val="2F5496"/>
     </w:rPr>
   </w:style>
@@ -3951,17 +3395,16 @@
       <w:outlineLvl w:val="5"/>
     </w:pPr>
     <w:rPr>
-      <w:rFonts w:ascii="Calibri Light" w:hAnsi="Calibri Light" w:eastAsia="Calibri Light" w:cs="Calibri Light"/>
+      <w:rFonts w:ascii="Calibri Light" w:eastAsia="Calibri Light" w:hAnsi="Calibri Light" w:cs="Calibri Light"/>
       <w:color w:val="1F3763"/>
     </w:rPr>
   </w:style>
-  <w:style w:type="character" w:styleId="DefaultParagraphFont" w:default="1">
+  <w:style w:type="character" w:default="1" w:styleId="DefaultParagraphFont">
     <w:name w:val="Default Paragraph Font"/>
     <w:uiPriority w:val="1"/>
-    <w:semiHidden/>
     <w:unhideWhenUsed/>
   </w:style>
-  <w:style w:type="table" w:styleId="TableNormal" w:default="1">
+  <w:style w:type="table" w:default="1" w:styleId="TableNormal">
     <w:name w:val="Normal Table"/>
     <w:uiPriority w:val="99"/>
     <w:semiHidden/>
@@ -3976,71 +3419,71 @@
       </w:tblCellMar>
     </w:tblPr>
   </w:style>
-  <w:style w:type="numbering" w:styleId="NoList" w:default="1">
+  <w:style w:type="numbering" w:default="1" w:styleId="NoList">
     <w:name w:val="No List"/>
     <w:uiPriority w:val="99"/>
     <w:semiHidden/>
     <w:unhideWhenUsed/>
   </w:style>
-  <w:style w:type="character" w:styleId="Heading1Char" w:customStyle="1">
+  <w:style w:type="character" w:customStyle="1" w:styleId="Heading1Char">
     <w:name w:val="Heading 1 Char"/>
     <w:basedOn w:val="DefaultParagraphFont"/>
     <w:link w:val="Heading1"/>
     <w:rPr>
-      <w:rFonts w:ascii="Calibri Light" w:hAnsi="Calibri Light" w:eastAsia="Calibri Light" w:cs="Calibri Light"/>
+      <w:rFonts w:ascii="Calibri Light" w:eastAsia="Calibri Light" w:hAnsi="Calibri Light" w:cs="Calibri Light"/>
       <w:color w:val="2F5496"/>
       <w:sz w:val="32"/>
       <w:szCs w:val="32"/>
     </w:rPr>
   </w:style>
-  <w:style w:type="character" w:styleId="Heading2Char" w:customStyle="1">
+  <w:style w:type="character" w:customStyle="1" w:styleId="Heading2Char">
     <w:name w:val="Heading 2 Char"/>
     <w:basedOn w:val="DefaultParagraphFont"/>
     <w:link w:val="Heading2"/>
     <w:rPr>
-      <w:rFonts w:ascii="Calibri Light" w:hAnsi="Calibri Light" w:eastAsia="Calibri Light" w:cs="Calibri Light"/>
+      <w:rFonts w:ascii="Calibri Light" w:eastAsia="Calibri Light" w:hAnsi="Calibri Light" w:cs="Calibri Light"/>
       <w:color w:val="2F5496"/>
       <w:sz w:val="26"/>
       <w:szCs w:val="26"/>
     </w:rPr>
   </w:style>
-  <w:style w:type="character" w:styleId="Heading3Char" w:customStyle="1">
+  <w:style w:type="character" w:customStyle="1" w:styleId="Heading3Char">
     <w:name w:val="Heading 3 Char"/>
     <w:basedOn w:val="DefaultParagraphFont"/>
     <w:link w:val="Heading3"/>
     <w:rPr>
-      <w:rFonts w:ascii="Calibri Light" w:hAnsi="Calibri Light" w:eastAsia="Calibri Light" w:cs="Calibri Light"/>
+      <w:rFonts w:ascii="Calibri Light" w:eastAsia="Calibri Light" w:hAnsi="Calibri Light" w:cs="Calibri Light"/>
       <w:color w:val="1F3763"/>
       <w:sz w:val="24"/>
       <w:szCs w:val="24"/>
     </w:rPr>
   </w:style>
-  <w:style w:type="character" w:styleId="Heading4Char" w:customStyle="1">
+  <w:style w:type="character" w:customStyle="1" w:styleId="Heading4Char">
     <w:name w:val="Heading 4 Char"/>
     <w:basedOn w:val="DefaultParagraphFont"/>
     <w:link w:val="Heading4"/>
     <w:rPr>
-      <w:rFonts w:ascii="Calibri Light" w:hAnsi="Calibri Light" w:eastAsia="Calibri Light" w:cs="Calibri Light"/>
+      <w:rFonts w:ascii="Calibri Light" w:eastAsia="Calibri Light" w:hAnsi="Calibri Light" w:cs="Calibri Light"/>
       <w:i/>
       <w:iCs/>
       <w:color w:val="2F5496"/>
     </w:rPr>
   </w:style>
-  <w:style w:type="character" w:styleId="Heading5Char" w:customStyle="1">
+  <w:style w:type="character" w:customStyle="1" w:styleId="Heading5Char">
     <w:name w:val="Heading 5 Char"/>
     <w:basedOn w:val="DefaultParagraphFont"/>
     <w:link w:val="Heading5"/>
     <w:rPr>
-      <w:rFonts w:ascii="Calibri Light" w:hAnsi="Calibri Light" w:eastAsia="Calibri Light" w:cs="Calibri Light"/>
+      <w:rFonts w:ascii="Calibri Light" w:eastAsia="Calibri Light" w:hAnsi="Calibri Light" w:cs="Calibri Light"/>
       <w:color w:val="2F5496"/>
     </w:rPr>
   </w:style>
-  <w:style w:type="character" w:styleId="Heading6Char" w:customStyle="1">
+  <w:style w:type="character" w:customStyle="1" w:styleId="Heading6Char">
     <w:name w:val="Heading 6 Char"/>
     <w:basedOn w:val="DefaultParagraphFont"/>
     <w:link w:val="Heading6"/>
     <w:rPr>
-      <w:rFonts w:ascii="Calibri Light" w:hAnsi="Calibri Light" w:eastAsia="Calibri Light" w:cs="Calibri Light"/>
+      <w:rFonts w:ascii="Calibri Light" w:eastAsia="Calibri Light" w:hAnsi="Calibri Light" w:cs="Calibri Light"/>
       <w:color w:val="1F3763"/>
     </w:rPr>
   </w:style>
@@ -4057,7 +3500,7 @@
       </w:tabs>
     </w:pPr>
   </w:style>
-  <w:style w:type="character" w:styleId="HeaderChar" w:customStyle="1">
+  <w:style w:type="character" w:customStyle="1" w:styleId="HeaderChar">
     <w:name w:val="Header Char"/>
     <w:basedOn w:val="DefaultParagraphFont"/>
     <w:link w:val="Header"/>
@@ -4076,7 +3519,7 @@
       </w:tabs>
     </w:pPr>
   </w:style>
-  <w:style w:type="character" w:styleId="FooterChar" w:customStyle="1">
+  <w:style w:type="character" w:customStyle="1" w:styleId="FooterChar">
     <w:name w:val="Footer Char"/>
     <w:basedOn w:val="DefaultParagraphFont"/>
     <w:link w:val="Footer"/>
@@ -4092,7 +3535,7 @@
       <w:u w:val="single"/>
     </w:rPr>
   </w:style>
-  <w:style w:type="character" w:styleId="UnresolvedMention1" w:customStyle="1">
+  <w:style w:type="character" w:customStyle="1" w:styleId="UnresolvedMention1">
     <w:name w:val="Unresolved Mention1"/>
     <w:basedOn w:val="DefaultParagraphFont"/>
     <w:uiPriority w:val="99"/>
@@ -4103,7 +3546,7 @@
       <w:shd w:val="clear" w:color="auto" w:fill="E1DFDD"/>
     </w:rPr>
   </w:style>
-  <w:style w:type="paragraph" w:styleId="Alamat" w:customStyle="1">
+  <w:style w:type="paragraph" w:customStyle="1" w:styleId="Alamat">
     <w:name w:val="Alamat"/>
     <w:basedOn w:val="Normal"/>
     <w:link w:val="AlamatChar"/>
@@ -4115,7 +3558,7 @@
       <w:sz w:val="14"/>
     </w:rPr>
   </w:style>
-  <w:style w:type="paragraph" w:styleId="KopSurat" w:customStyle="1">
+  <w:style w:type="paragraph" w:customStyle="1" w:styleId="KopSurat">
     <w:name w:val="Kop Surat"/>
     <w:basedOn w:val="Normal"/>
     <w:link w:val="KopSuratChar"/>
@@ -4127,7 +3570,7 @@
       <w:b/>
     </w:rPr>
   </w:style>
-  <w:style w:type="character" w:styleId="AlamatChar" w:customStyle="1">
+  <w:style w:type="character" w:customStyle="1" w:styleId="AlamatChar">
     <w:name w:val="Alamat Char"/>
     <w:basedOn w:val="DefaultParagraphFont"/>
     <w:link w:val="Alamat"/>
@@ -4136,7 +3579,7 @@
       <w:sz w:val="14"/>
     </w:rPr>
   </w:style>
-  <w:style w:type="character" w:styleId="KopSuratChar" w:customStyle="1">
+  <w:style w:type="character" w:customStyle="1" w:styleId="KopSuratChar">
     <w:name w:val="Kop Surat Char"/>
     <w:basedOn w:val="DefaultParagraphFont"/>
     <w:link w:val="KopSurat"/>
@@ -4145,7 +3588,7 @@
       <w:b/>
     </w:rPr>
   </w:style>
-  <w:style w:type="paragraph" w:styleId="Arial11" w:customStyle="1">
+  <w:style w:type="paragraph" w:customStyle="1" w:styleId="Arial11">
     <w:name w:val="Arial 11"/>
     <w:basedOn w:val="Normal"/>
     <w:link w:val="Arial11Char"/>
@@ -4155,7 +3598,7 @@
       <w:noProof/>
     </w:rPr>
   </w:style>
-  <w:style w:type="character" w:styleId="Arial11Char" w:customStyle="1">
+  <w:style w:type="character" w:customStyle="1" w:styleId="Arial11Char">
     <w:name w:val="Arial 11 Char"/>
     <w:basedOn w:val="DefaultParagraphFont"/>
     <w:link w:val="Arial11"/>
@@ -4171,12 +3614,12 @@
     <w:uiPriority w:val="39"/>
     <w:tblPr>
       <w:tblBorders>
-        <w:top w:val="single" w:color="auto" w:sz="4" w:space="0"/>
-        <w:left w:val="single" w:color="auto" w:sz="4" w:space="0"/>
-        <w:bottom w:val="single" w:color="auto" w:sz="4" w:space="0"/>
-        <w:right w:val="single" w:color="auto" w:sz="4" w:space="0"/>
-        <w:insideH w:val="single" w:color="auto" w:sz="4" w:space="0"/>
-        <w:insideV w:val="single" w:color="auto" w:sz="4" w:space="0"/>
+        <w:top w:val="single" w:sz="4" w:space="0" w:color="auto"/>
+        <w:left w:val="single" w:sz="4" w:space="0" w:color="auto"/>
+        <w:bottom w:val="single" w:sz="4" w:space="0" w:color="auto"/>
+        <w:right w:val="single" w:sz="4" w:space="0" w:color="auto"/>
+        <w:insideH w:val="single" w:sz="4" w:space="0" w:color="auto"/>
+        <w:insideV w:val="single" w:sz="4" w:space="0" w:color="auto"/>
       </w:tblBorders>
     </w:tblPr>
   </w:style>
@@ -4184,7 +3627,7 @@
 </file>
 
 <file path=word/theme/theme1.xml><?xml version="1.0" encoding="utf-8"?>
-<a:theme xmlns:a="http://schemas.openxmlformats.org/drawingml/2006/main" xmlns:thm15="http://schemas.microsoft.com/office/thememl/2012/main" name="Office Theme">
+<a:theme xmlns:a="http://schemas.openxmlformats.org/drawingml/2006/main" name="Office Theme">
   <a:themeElements>
     <a:clrScheme name="Office">
       <a:dk1>
@@ -4482,15 +3925,6 @@
 </file>
 
 <file path=customXml/item1.xml><?xml version="1.0" encoding="utf-8"?>
-<?mso-contentType ?>
-<FormTemplates xmlns="http://schemas.microsoft.com/sharepoint/v3/contenttype/forms">
-  <Display>DocumentLibraryForm</Display>
-  <Edit>DocumentLibraryForm</Edit>
-  <New>DocumentLibraryForm</New>
-</FormTemplates>
-</file>
-
-<file path=customXml/item2.xml><?xml version="1.0" encoding="utf-8"?>
 <p:properties xmlns:p="http://schemas.microsoft.com/office/2006/metadata/properties" xmlns:xsi="http://www.w3.org/2001/XMLSchema-instance" xmlns:pc="http://schemas.microsoft.com/office/infopath/2007/PartnerControls">
   <documentManagement>
     <TaxCatchAll xmlns="6a3343e3-a342-4977-82e8-547b9d40dd28" xsi:nil="true"/>
@@ -4499,6 +3933,15 @@
     </lcf76f155ced4ddcb4097134ff3c332f>
   </documentManagement>
 </p:properties>
+</file>
+
+<file path=customXml/item2.xml><?xml version="1.0" encoding="utf-8"?>
+<?mso-contentType ?>
+<FormTemplates xmlns="http://schemas.microsoft.com/sharepoint/v3/contenttype/forms">
+  <Display>DocumentLibraryForm</Display>
+  <Edit>DocumentLibraryForm</Edit>
+  <New>DocumentLibraryForm</New>
+</FormTemplates>
 </file>
 
 <file path=customXml/item3.xml><?xml version="1.0" encoding="utf-8"?>
@@ -4697,6 +4140,17 @@
 </file>
 
 <file path=customXml/itemProps1.xml><?xml version="1.0" encoding="utf-8"?>
+<ds:datastoreItem xmlns:ds="http://schemas.openxmlformats.org/officeDocument/2006/customXml" ds:itemID="{68F97C91-8AAA-4241-BFB3-79DE058C21C2}">
+  <ds:schemaRefs>
+    <ds:schemaRef ds:uri="http://schemas.microsoft.com/office/2006/metadata/properties"/>
+    <ds:schemaRef ds:uri="http://schemas.microsoft.com/office/infopath/2007/PartnerControls"/>
+    <ds:schemaRef ds:uri="6a3343e3-a342-4977-82e8-547b9d40dd28"/>
+    <ds:schemaRef ds:uri="122b6bc9-85c8-4cf1-91e6-8e70987f848c"/>
+  </ds:schemaRefs>
+</ds:datastoreItem>
+</file>
+
+<file path=customXml/itemProps2.xml><?xml version="1.0" encoding="utf-8"?>
 <ds:datastoreItem xmlns:ds="http://schemas.openxmlformats.org/officeDocument/2006/customXml" ds:itemID="{016BB153-861F-4192-A688-0C944E34872E}">
   <ds:schemaRefs>
     <ds:schemaRef ds:uri="http://schemas.microsoft.com/sharepoint/v3/contenttype/forms"/>
@@ -4704,17 +4158,21 @@
 </ds:datastoreItem>
 </file>
 
-<file path=customXml/itemProps2.xml><?xml version="1.0" encoding="utf-8"?>
-<ds:datastoreItem xmlns:ds="http://schemas.openxmlformats.org/officeDocument/2006/customXml" ds:itemID="{68F97C91-8AAA-4241-BFB3-79DE058C21C2}">
+<file path=customXml/itemProps3.xml><?xml version="1.0" encoding="utf-8"?>
+<ds:datastoreItem xmlns:ds="http://schemas.openxmlformats.org/officeDocument/2006/customXml" ds:itemID="{0A47C658-F63E-47F6-A427-BC8A09BB435F}">
   <ds:schemaRefs>
+    <ds:schemaRef ds:uri="http://schemas.microsoft.com/office/2006/metadata/contentType"/>
+    <ds:schemaRef ds:uri="http://schemas.microsoft.com/office/2006/metadata/properties/metaAttributes"/>
+    <ds:schemaRef ds:uri="http://www.w3.org/2001/XMLSchema"/>
     <ds:schemaRef ds:uri="http://schemas.microsoft.com/office/2006/metadata/properties"/>
+    <ds:schemaRef ds:uri="122b6bc9-85c8-4cf1-91e6-8e70987f848c"/>
+    <ds:schemaRef ds:uri="6a3343e3-a342-4977-82e8-547b9d40dd28"/>
+    <ds:schemaRef ds:uri="http://schemas.microsoft.com/office/2006/documentManagement/types"/>
     <ds:schemaRef ds:uri="http://schemas.microsoft.com/office/infopath/2007/PartnerControls"/>
-    <ds:schemaRef ds:uri="0ef7128f-a7d0-43d2-bee4-5f56f49c64da"/>
-    <ds:schemaRef ds:uri="6d95bc28-2e5c-4ccd-92aa-ea746d833732"/>
+    <ds:schemaRef ds:uri="http://schemas.openxmlformats.org/package/2006/metadata/core-properties"/>
+    <ds:schemaRef ds:uri="http://purl.org/dc/elements/1.1/"/>
+    <ds:schemaRef ds:uri="http://purl.org/dc/terms/"/>
+    <ds:schemaRef ds:uri="http://schemas.microsoft.com/internal/obd"/>
   </ds:schemaRefs>
 </ds:datastoreItem>
-</file>
-
-<file path=customXml/itemProps3.xml><?xml version="1.0" encoding="utf-8"?>
-<ds:datastoreItem xmlns:ds="http://schemas.openxmlformats.org/officeDocument/2006/customXml" ds:itemID="{0A47C658-F63E-47F6-A427-BC8A09BB435F}"/>
 </file>
</xml_diff>